<commit_message>
FPVTL-2249 populate future hearing on header and use Arial font
</commit_message>
<xml_diff>
--- a/src/main/resources/templates/CustomOrderHeader.docx
+++ b/src/main/resources/templates/CustomOrderHeader.docx
@@ -18,8 +18,8 @@
       </w:tblPr>
       <w:tblGrid>
         <w:gridCol w:w="1563"/>
-        <w:gridCol w:w="4444"/>
-        <w:gridCol w:w="3019"/>
+        <w:gridCol w:w="3824"/>
+        <w:gridCol w:w="3639"/>
       </w:tblGrid>
       <w:tr>
         <w:trPr>
@@ -32,12 +32,12 @@
           <w:p>
             <w:pPr>
               <w:rPr>
-                <w:b/>
-              </w:rPr>
-            </w:pPr>
-            <w:r>
-              <w:rPr>
-                <w:b/>
+                <w:rFonts w:ascii="Arial" w:hAnsi="Arial" w:cs="Arial"/>
+              </w:rPr>
+            </w:pPr>
+            <w:r>
+              <w:rPr>
+                <w:rFonts w:ascii="Arial" w:hAnsi="Arial" w:cs="Arial"/>
                 <w:noProof/>
               </w:rPr>
               <w:drawing>
@@ -86,19 +86,19 @@
         </w:tc>
         <w:tc>
           <w:tcPr>
-            <w:tcW w:w="4444" w:type="dxa"/>
-          </w:tcPr>
-          <w:p>
-            <w:pPr>
-              <w:rPr>
-                <w:rFonts w:ascii="Times New Roman" w:hAnsi="Times New Roman" w:cs="Times New Roman (Body CS)"/>
+            <w:tcW w:w="3824" w:type="dxa"/>
+          </w:tcPr>
+          <w:p>
+            <w:pPr>
+              <w:rPr>
+                <w:rFonts w:ascii="Arial" w:hAnsi="Arial" w:cs="Arial"/>
                 <w:sz w:val="32"/>
                 <w:szCs w:val="28"/>
               </w:rPr>
             </w:pPr>
             <w:r>
               <w:rPr>
-                <w:rFonts w:ascii="Times New Roman" w:hAnsi="Times New Roman" w:cs="Times New Roman (Body CS)"/>
+                <w:rFonts w:ascii="Arial" w:hAnsi="Arial" w:cs="Arial"/>
                 <w:sz w:val="32"/>
                 <w:szCs w:val="28"/>
               </w:rPr>
@@ -108,110 +108,106 @@
           <w:p>
             <w:pPr>
               <w:rPr>
-                <w:rFonts w:ascii="Times New Roman" w:hAnsi="Times New Roman" w:cs="Times New Roman (Body CS)"/>
-                <w:bCs/>
+                <w:rFonts w:ascii="Arial" w:hAnsi="Arial" w:cs="Arial"/>
+                <w:sz w:val="32"/>
+              </w:rPr>
+            </w:pPr>
+            <w:r>
+              <w:rPr>
+                <w:rFonts w:ascii="Arial" w:hAnsi="Arial" w:cs="Arial"/>
                 <w:sz w:val="32"/>
                 <w:szCs w:val="28"/>
               </w:rPr>
-            </w:pPr>
-            <w:r>
-              <w:rPr>
-                <w:rFonts w:ascii="Times New Roman" w:hAnsi="Times New Roman" w:cs="Times New Roman (Body CS)"/>
-                <w:bCs/>
+              <w:t xml:space="preserve">sitting at </w:t>
+            </w:r>
+            <w:r>
+              <w:rPr>
+                <w:rFonts w:ascii="Arial" w:hAnsi="Arial" w:cs="Arial"/>
+                <w:sz w:val="32"/>
+              </w:rPr>
+              <w:t>{{</w:t>
+            </w:r>
+            <w:proofErr w:type="spellStart"/>
+            <w:r>
+              <w:rPr>
+                <w:rFonts w:ascii="Arial" w:hAnsi="Arial" w:cs="Arial"/>
+                <w:sz w:val="32"/>
+              </w:rPr>
+              <w:t>courtName</w:t>
+            </w:r>
+            <w:proofErr w:type="spellEnd"/>
+            <w:r>
+              <w:rPr>
+                <w:rFonts w:ascii="Arial" w:hAnsi="Arial" w:cs="Arial"/>
+                <w:sz w:val="32"/>
+              </w:rPr>
+              <w:t>}}</w:t>
+            </w:r>
+          </w:p>
+          <w:p>
+            <w:pPr>
+              <w:rPr>
+                <w:rFonts w:ascii="Arial" w:hAnsi="Arial" w:cs="Arial"/>
                 <w:sz w:val="32"/>
                 <w:szCs w:val="28"/>
               </w:rPr>
-              <w:t xml:space="preserve">sitting at </w:t>
-            </w:r>
-            <w:r>
-              <w:rPr>
-                <w:rFonts w:ascii="Times New Roman" w:hAnsi="Times New Roman" w:cs="Times New Roman (Body CS)"/>
-                <w:bCs/>
+            </w:pPr>
+          </w:p>
+        </w:tc>
+        <w:tc>
+          <w:tcPr>
+            <w:tcW w:w="3639" w:type="dxa"/>
+          </w:tcPr>
+          <w:p>
+            <w:pPr>
+              <w:rPr>
+                <w:rFonts w:ascii="Arial" w:hAnsi="Arial" w:cs="Arial"/>
                 <w:sz w:val="32"/>
               </w:rPr>
+            </w:pPr>
+            <w:r>
+              <w:rPr>
+                <w:rFonts w:ascii="Arial" w:hAnsi="Arial" w:cs="Arial"/>
+                <w:sz w:val="32"/>
+              </w:rPr>
+              <w:t>Case No:</w:t>
+            </w:r>
+          </w:p>
+          <w:p>
+            <w:pPr>
+              <w:rPr>
+                <w:rFonts w:ascii="Arial" w:hAnsi="Arial" w:cs="Arial"/>
+                <w:sz w:val="32"/>
+              </w:rPr>
+            </w:pPr>
+            <w:r>
+              <w:rPr>
+                <w:rFonts w:ascii="Arial" w:hAnsi="Arial" w:cs="Arial"/>
+                <w:sz w:val="32"/>
+              </w:rPr>
               <w:t>{{</w:t>
             </w:r>
             <w:proofErr w:type="spellStart"/>
             <w:r>
               <w:rPr>
-                <w:rFonts w:ascii="Times New Roman" w:hAnsi="Times New Roman" w:cs="Times New Roman (Body CS)"/>
-                <w:b/>
+                <w:rFonts w:ascii="Arial" w:hAnsi="Arial" w:cs="Arial"/>
                 <w:sz w:val="32"/>
               </w:rPr>
-              <w:t>courtName</w:t>
+              <w:t>caseNumber</w:t>
             </w:r>
             <w:proofErr w:type="spellEnd"/>
             <w:r>
               <w:rPr>
-                <w:rFonts w:ascii="Times New Roman" w:hAnsi="Times New Roman" w:cs="Times New Roman (Body CS)"/>
-                <w:bCs/>
+                <w:rFonts w:ascii="Arial" w:hAnsi="Arial" w:cs="Arial"/>
                 <w:sz w:val="32"/>
               </w:rPr>
               <w:t>}}</w:t>
             </w:r>
           </w:p>
-        </w:tc>
-        <w:tc>
-          <w:tcPr>
-            <w:tcW w:w="3019" w:type="dxa"/>
-          </w:tcPr>
-          <w:p>
-            <w:pPr>
-              <w:rPr>
-                <w:rFonts w:ascii="Times New Roman" w:hAnsi="Times New Roman" w:cs="Times New Roman (Body CS)"/>
-                <w:bCs/>
-                <w:sz w:val="32"/>
-              </w:rPr>
-            </w:pPr>
-            <w:r>
-              <w:rPr>
-                <w:rFonts w:ascii="Times New Roman" w:hAnsi="Times New Roman" w:cs="Times New Roman (Body CS)"/>
-                <w:bCs/>
-                <w:sz w:val="32"/>
-              </w:rPr>
-              <w:t>Case No:</w:t>
-            </w:r>
-          </w:p>
-          <w:p>
-            <w:pPr>
-              <w:rPr>
-                <w:rFonts w:ascii="Times New Roman" w:hAnsi="Times New Roman" w:cs="Times New Roman (Body CS)"/>
-                <w:bCs/>
-                <w:sz w:val="32"/>
-              </w:rPr>
-            </w:pPr>
-            <w:r>
-              <w:rPr>
-                <w:rFonts w:ascii="Times New Roman" w:hAnsi="Times New Roman" w:cs="Times New Roman (Body CS)"/>
-                <w:bCs/>
-                <w:sz w:val="32"/>
-              </w:rPr>
-              <w:t>{{</w:t>
-            </w:r>
-            <w:proofErr w:type="spellStart"/>
-            <w:r>
-              <w:rPr>
-                <w:rFonts w:ascii="Times New Roman" w:hAnsi="Times New Roman" w:cs="Times New Roman (Body CS)"/>
-                <w:b/>
-                <w:sz w:val="32"/>
-              </w:rPr>
-              <w:t>caseNumber</w:t>
-            </w:r>
-            <w:proofErr w:type="spellEnd"/>
-            <w:r>
-              <w:rPr>
-                <w:rFonts w:ascii="Times New Roman" w:hAnsi="Times New Roman" w:cs="Times New Roman (Body CS)"/>
-                <w:bCs/>
-                <w:sz w:val="32"/>
-              </w:rPr>
-              <w:t>}}</w:t>
-            </w:r>
-          </w:p>
-          <w:p>
-            <w:pPr>
-              <w:rPr>
-                <w:rFonts w:cs="Times New Roman (Body CS)"/>
-                <w:bCs/>
+          <w:p>
+            <w:pPr>
+              <w:rPr>
+                <w:rFonts w:ascii="Arial" w:hAnsi="Arial" w:cs="Arial"/>
                 <w:sz w:val="32"/>
               </w:rPr>
             </w:pPr>
@@ -245,7 +241,13 @@
           <w:tcPr>
             <w:tcW w:w="1418" w:type="dxa"/>
           </w:tcPr>
-          <w:p/>
+          <w:p>
+            <w:pPr>
+              <w:rPr>
+                <w:rFonts w:ascii="Arial" w:hAnsi="Arial" w:cs="Arial"/>
+              </w:rPr>
+            </w:pPr>
+          </w:p>
         </w:tc>
         <w:tc>
           <w:tcPr>
@@ -264,14 +266,12 @@
           <w:p>
             <w:pPr>
               <w:rPr>
-                <w:rFonts w:ascii="Times New Roman" w:hAnsi="Times New Roman" w:cs="Times New Roman (Body CS)"/>
-                <w:b/>
-              </w:rPr>
-            </w:pPr>
-            <w:r>
-              <w:rPr>
-                <w:rFonts w:ascii="Times New Roman" w:hAnsi="Times New Roman" w:cs="Times New Roman (Body CS)"/>
-                <w:b/>
+                <w:rFonts w:ascii="Arial" w:hAnsi="Arial" w:cs="Arial"/>
+              </w:rPr>
+            </w:pPr>
+            <w:r>
+              <w:rPr>
+                <w:rFonts w:ascii="Arial" w:hAnsi="Arial" w:cs="Arial"/>
               </w:rPr>
               <w:t>Order</w:t>
             </w:r>
@@ -279,29 +279,26 @@
           <w:p>
             <w:pPr>
               <w:rPr>
-                <w:rFonts w:ascii="Times New Roman" w:hAnsi="Times New Roman" w:cs="Times New Roman (Body CS)"/>
-              </w:rPr>
-            </w:pPr>
-            <w:r>
-              <w:rPr>
-                <w:rFonts w:ascii="Times New Roman" w:hAnsi="Times New Roman" w:cs="Times New Roman (Body CS)"/>
-                <w:b/>
+                <w:rFonts w:ascii="Arial" w:hAnsi="Arial" w:cs="Arial"/>
+              </w:rPr>
+            </w:pPr>
+            <w:r>
+              <w:rPr>
+                <w:rFonts w:ascii="Arial" w:hAnsi="Arial" w:cs="Arial"/>
               </w:rPr>
               <w:t>{{</w:t>
             </w:r>
             <w:proofErr w:type="spellStart"/>
             <w:r>
               <w:rPr>
-                <w:rFonts w:ascii="Times New Roman" w:hAnsi="Times New Roman" w:cs="Times New Roman (Body CS)"/>
-                <w:b/>
+                <w:rFonts w:ascii="Arial" w:hAnsi="Arial" w:cs="Arial"/>
               </w:rPr>
               <w:t>orderName</w:t>
             </w:r>
             <w:proofErr w:type="spellEnd"/>
             <w:r>
               <w:rPr>
-                <w:rFonts w:ascii="Times New Roman" w:hAnsi="Times New Roman" w:cs="Times New Roman (Body CS)"/>
-                <w:b/>
+                <w:rFonts w:ascii="Arial" w:hAnsi="Arial" w:cs="Arial"/>
               </w:rPr>
               <w:t>}}</w:t>
             </w:r>
@@ -313,7 +310,13 @@
           <w:tcPr>
             <w:tcW w:w="1418" w:type="dxa"/>
           </w:tcPr>
-          <w:p/>
+          <w:p>
+            <w:pPr>
+              <w:rPr>
+                <w:rFonts w:ascii="Arial" w:hAnsi="Arial" w:cs="Arial"/>
+              </w:rPr>
+            </w:pPr>
+          </w:p>
         </w:tc>
         <w:tc>
           <w:tcPr>
@@ -325,7 +328,7 @@
           <w:p>
             <w:pPr>
               <w:rPr>
-                <w:rFonts w:ascii="Times New Roman" w:hAnsi="Times New Roman" w:cs="Times New Roman (Body CS)"/>
+                <w:rFonts w:ascii="Arial" w:hAnsi="Arial" w:cs="Arial"/>
               </w:rPr>
             </w:pPr>
           </w:p>
@@ -340,7 +343,7 @@
           <w:p>
             <w:pPr>
               <w:rPr>
-                <w:rFonts w:ascii="Times New Roman" w:hAnsi="Times New Roman" w:cs="Times New Roman (Body CS)"/>
+                <w:rFonts w:ascii="Arial" w:hAnsi="Arial" w:cs="Arial"/>
               </w:rPr>
             </w:pPr>
           </w:p>
@@ -355,7 +358,7 @@
           <w:p>
             <w:pPr>
               <w:rPr>
-                <w:rFonts w:ascii="Times New Roman" w:hAnsi="Times New Roman" w:cs="Times New Roman (Body CS)"/>
+                <w:rFonts w:ascii="Arial" w:hAnsi="Arial" w:cs="Arial"/>
               </w:rPr>
             </w:pPr>
           </w:p>
@@ -366,7 +369,13 @@
           <w:tcPr>
             <w:tcW w:w="1418" w:type="dxa"/>
           </w:tcPr>
-          <w:p/>
+          <w:p>
+            <w:pPr>
+              <w:rPr>
+                <w:rFonts w:ascii="Arial" w:hAnsi="Arial" w:cs="Arial"/>
+              </w:rPr>
+            </w:pPr>
+          </w:p>
         </w:tc>
         <w:tc>
           <w:tcPr>
@@ -375,12 +384,12 @@
           <w:p>
             <w:pPr>
               <w:rPr>
-                <w:rFonts w:ascii="Times New Roman" w:hAnsi="Times New Roman" w:cs="Times New Roman (Body CS)"/>
-              </w:rPr>
-            </w:pPr>
-            <w:r>
-              <w:rPr>
-                <w:rFonts w:ascii="Times New Roman" w:hAnsi="Times New Roman" w:cs="Times New Roman (Body CS)"/>
+                <w:rFonts w:ascii="Arial" w:hAnsi="Arial" w:cs="Arial"/>
+              </w:rPr>
+            </w:pPr>
+            <w:r>
+              <w:rPr>
+                <w:rFonts w:ascii="Arial" w:hAnsi="Arial" w:cs="Arial"/>
               </w:rPr>
               <w:t>The full name(s) of the child(ren)</w:t>
             </w:r>
@@ -393,12 +402,12 @@
           <w:p>
             <w:pPr>
               <w:rPr>
-                <w:rFonts w:ascii="Times New Roman" w:hAnsi="Times New Roman" w:cs="Times New Roman (Body CS)"/>
-              </w:rPr>
-            </w:pPr>
-            <w:r>
-              <w:rPr>
-                <w:rFonts w:ascii="Times New Roman" w:hAnsi="Times New Roman" w:cs="Times New Roman (Body CS)"/>
+                <w:rFonts w:ascii="Arial" w:hAnsi="Arial" w:cs="Arial"/>
+              </w:rPr>
+            </w:pPr>
+            <w:r>
+              <w:rPr>
+                <w:rFonts w:ascii="Arial" w:hAnsi="Arial" w:cs="Arial"/>
               </w:rPr>
               <w:t>Sex</w:t>
             </w:r>
@@ -411,12 +420,12 @@
           <w:p>
             <w:pPr>
               <w:rPr>
-                <w:rFonts w:ascii="Times New Roman" w:hAnsi="Times New Roman" w:cs="Times New Roman (Body CS)"/>
-              </w:rPr>
-            </w:pPr>
-            <w:r>
-              <w:rPr>
-                <w:rFonts w:ascii="Times New Roman" w:hAnsi="Times New Roman" w:cs="Times New Roman (Body CS)"/>
+                <w:rFonts w:ascii="Arial" w:hAnsi="Arial" w:cs="Arial"/>
+              </w:rPr>
+            </w:pPr>
+            <w:r>
+              <w:rPr>
+                <w:rFonts w:ascii="Arial" w:hAnsi="Arial" w:cs="Arial"/>
               </w:rPr>
               <w:t>Date(s) of Birth</w:t>
             </w:r>
@@ -431,7 +440,13 @@
           <w:tcPr>
             <w:tcW w:w="1418" w:type="dxa"/>
           </w:tcPr>
-          <w:p/>
+          <w:p>
+            <w:pPr>
+              <w:rPr>
+                <w:rFonts w:ascii="Arial" w:hAnsi="Arial" w:cs="Arial"/>
+              </w:rPr>
+            </w:pPr>
+          </w:p>
         </w:tc>
         <w:tc>
           <w:tcPr>
@@ -440,7 +455,7 @@
           <w:p>
             <w:pPr>
               <w:rPr>
-                <w:rFonts w:ascii="Times New Roman" w:hAnsi="Times New Roman" w:cs="Times New Roman (Body CS)"/>
+                <w:rFonts w:ascii="Arial" w:hAnsi="Arial" w:cs="Arial"/>
               </w:rPr>
             </w:pPr>
           </w:p>
@@ -452,7 +467,7 @@
           <w:p>
             <w:pPr>
               <w:rPr>
-                <w:rFonts w:ascii="Times New Roman" w:hAnsi="Times New Roman" w:cs="Times New Roman (Body CS)"/>
+                <w:rFonts w:ascii="Arial" w:hAnsi="Arial" w:cs="Arial"/>
               </w:rPr>
             </w:pPr>
           </w:p>
@@ -464,7 +479,7 @@
           <w:p>
             <w:pPr>
               <w:rPr>
-                <w:rFonts w:ascii="Times New Roman" w:hAnsi="Times New Roman" w:cs="Times New Roman (Body CS)"/>
+                <w:rFonts w:ascii="Arial" w:hAnsi="Arial" w:cs="Arial"/>
               </w:rPr>
             </w:pPr>
           </w:p>
@@ -478,7 +493,13 @@
           <w:tcPr>
             <w:tcW w:w="1418" w:type="dxa"/>
           </w:tcPr>
-          <w:p/>
+          <w:p>
+            <w:pPr>
+              <w:rPr>
+                <w:rFonts w:ascii="Arial" w:hAnsi="Arial" w:cs="Arial"/>
+              </w:rPr>
+            </w:pPr>
+          </w:p>
         </w:tc>
         <w:tc>
           <w:tcPr>
@@ -487,19 +508,19 @@
           <w:p>
             <w:pPr>
               <w:rPr>
-                <w:rFonts w:ascii="Times New Roman" w:hAnsi="Times New Roman" w:cs="Times New Roman (Body CS)"/>
-              </w:rPr>
-            </w:pPr>
-            <w:r>
-              <w:rPr>
-                <w:rFonts w:ascii="Times New Roman" w:hAnsi="Times New Roman" w:cs="Times New Roman (Body CS)"/>
+                <w:rFonts w:ascii="Arial" w:hAnsi="Arial" w:cs="Arial"/>
+              </w:rPr>
+            </w:pPr>
+            <w:r>
+              <w:rPr>
+                <w:rFonts w:ascii="Arial" w:hAnsi="Arial" w:cs="Arial"/>
               </w:rPr>
               <w:t>{{children</w:t>
             </w:r>
             <w:proofErr w:type="gramStart"/>
             <w:r>
               <w:rPr>
-                <w:rFonts w:ascii="Times New Roman" w:hAnsi="Times New Roman" w:cs="Times New Roman (Body CS)"/>
+                <w:rFonts w:ascii="Arial" w:hAnsi="Arial" w:cs="Arial"/>
               </w:rPr>
               <w:t>}}[</w:t>
             </w:r>
@@ -507,14 +528,14 @@
             <w:proofErr w:type="gramEnd"/>
             <w:r>
               <w:rPr>
-                <w:rFonts w:ascii="Times New Roman" w:hAnsi="Times New Roman" w:cs="Times New Roman (Body CS)"/>
+                <w:rFonts w:ascii="Arial" w:hAnsi="Arial" w:cs="Arial"/>
               </w:rPr>
               <w:t>fullName</w:t>
             </w:r>
             <w:proofErr w:type="spellEnd"/>
             <w:r>
               <w:rPr>
-                <w:rFonts w:ascii="Times New Roman" w:hAnsi="Times New Roman" w:cs="Times New Roman (Body CS)"/>
+                <w:rFonts w:ascii="Arial" w:hAnsi="Arial" w:cs="Arial"/>
               </w:rPr>
               <w:t>]</w:t>
             </w:r>
@@ -527,12 +548,12 @@
           <w:p>
             <w:pPr>
               <w:rPr>
-                <w:rFonts w:ascii="Times New Roman" w:hAnsi="Times New Roman" w:cs="Times New Roman (Body CS)"/>
-              </w:rPr>
-            </w:pPr>
-            <w:r>
-              <w:rPr>
-                <w:rFonts w:ascii="Times New Roman" w:hAnsi="Times New Roman" w:cs="Times New Roman (Body CS)"/>
+                <w:rFonts w:ascii="Arial" w:hAnsi="Arial" w:cs="Arial"/>
+              </w:rPr>
+            </w:pPr>
+            <w:r>
+              <w:rPr>
+                <w:rFonts w:ascii="Arial" w:hAnsi="Arial" w:cs="Arial"/>
               </w:rPr>
               <w:t>[gender]</w:t>
             </w:r>
@@ -545,12 +566,12 @@
           <w:p>
             <w:pPr>
               <w:rPr>
-                <w:rFonts w:ascii="Times New Roman" w:hAnsi="Times New Roman" w:cs="Times New Roman (Body CS)"/>
-              </w:rPr>
-            </w:pPr>
-            <w:r>
-              <w:rPr>
-                <w:rFonts w:ascii="Times New Roman" w:hAnsi="Times New Roman" w:cs="Times New Roman (Body CS)"/>
+                <w:rFonts w:ascii="Arial" w:hAnsi="Arial" w:cs="Arial"/>
+              </w:rPr>
+            </w:pPr>
+            <w:r>
+              <w:rPr>
+                <w:rFonts w:ascii="Arial" w:hAnsi="Arial" w:cs="Arial"/>
               </w:rPr>
               <w:t>[dob]</w:t>
             </w:r>
@@ -562,19 +583,37 @@
           <w:tcPr>
             <w:tcW w:w="1418" w:type="dxa"/>
           </w:tcPr>
-          <w:p/>
+          <w:p>
+            <w:pPr>
+              <w:rPr>
+                <w:rFonts w:ascii="Arial" w:hAnsi="Arial" w:cs="Arial"/>
+              </w:rPr>
+            </w:pPr>
+          </w:p>
         </w:tc>
         <w:tc>
           <w:tcPr>
             <w:tcW w:w="3118" w:type="dxa"/>
           </w:tcPr>
-          <w:p/>
+          <w:p>
+            <w:pPr>
+              <w:rPr>
+                <w:rFonts w:ascii="Arial" w:hAnsi="Arial" w:cs="Arial"/>
+              </w:rPr>
+            </w:pPr>
+          </w:p>
         </w:tc>
         <w:tc>
           <w:tcPr>
             <w:tcW w:w="2221" w:type="dxa"/>
           </w:tcPr>
-          <w:p/>
+          <w:p>
+            <w:pPr>
+              <w:rPr>
+                <w:rFonts w:ascii="Arial" w:hAnsi="Arial" w:cs="Arial"/>
+              </w:rPr>
+            </w:pPr>
+          </w:p>
         </w:tc>
         <w:tc>
           <w:tcPr>
@@ -583,6 +622,7 @@
           <w:p>
             <w:pPr>
               <w:rPr>
+                <w:rFonts w:ascii="Arial" w:hAnsi="Arial" w:cs="Arial"/>
                 <w:color w:val="FF0000"/>
               </w:rPr>
             </w:pPr>
@@ -594,198 +634,211 @@
           <w:tcPr>
             <w:tcW w:w="1418" w:type="dxa"/>
           </w:tcPr>
-          <w:p/>
+          <w:p>
+            <w:pPr>
+              <w:rPr>
+                <w:rFonts w:ascii="Arial" w:hAnsi="Arial" w:cs="Arial"/>
+              </w:rPr>
+            </w:pPr>
+          </w:p>
         </w:tc>
         <w:tc>
           <w:tcPr>
             <w:tcW w:w="3118" w:type="dxa"/>
           </w:tcPr>
-          <w:p/>
+          <w:p>
+            <w:pPr>
+              <w:rPr>
+                <w:rFonts w:ascii="Arial" w:hAnsi="Arial" w:cs="Arial"/>
+              </w:rPr>
+            </w:pPr>
+          </w:p>
         </w:tc>
         <w:tc>
           <w:tcPr>
             <w:tcW w:w="2221" w:type="dxa"/>
           </w:tcPr>
-          <w:p/>
+          <w:p>
+            <w:pPr>
+              <w:rPr>
+                <w:rFonts w:ascii="Arial" w:hAnsi="Arial" w:cs="Arial"/>
+              </w:rPr>
+            </w:pPr>
+          </w:p>
         </w:tc>
         <w:tc>
           <w:tcPr>
             <w:tcW w:w="2253" w:type="dxa"/>
           </w:tcPr>
-          <w:p/>
+          <w:p>
+            <w:pPr>
+              <w:rPr>
+                <w:rFonts w:ascii="Arial" w:hAnsi="Arial" w:cs="Arial"/>
+              </w:rPr>
+            </w:pPr>
+          </w:p>
         </w:tc>
       </w:tr>
     </w:tbl>
-    <w:p/>
-    <w:p/>
     <w:p>
       <w:pPr>
         <w:rPr>
-          <w:rFonts w:ascii="Times New Roman" w:hAnsi="Times New Roman" w:cs="Times New Roman (Body CS)"/>
-        </w:rPr>
-      </w:pPr>
-      <w:r>
-        <w:rPr>
-          <w:rFonts w:ascii="Times New Roman" w:hAnsi="Times New Roman" w:cs="Times New Roman (Body CS)"/>
-        </w:rPr>
-        <w:t xml:space="preserve">Before </w:t>
-      </w:r>
-      <w:r>
-        <w:rPr>
-          <w:rFonts w:ascii="Times New Roman" w:hAnsi="Times New Roman" w:cs="Times New Roman (Body CS)"/>
-          <w:b/>
-          <w:bCs/>
-        </w:rPr>
-        <w:t>{{</w:t>
-      </w:r>
-      <w:proofErr w:type="spellStart"/>
-      <w:r>
-        <w:rPr>
-          <w:rFonts w:ascii="Times New Roman" w:hAnsi="Times New Roman" w:cs="Times New Roman (Body CS)"/>
-          <w:b/>
-          <w:bCs/>
-        </w:rPr>
-        <w:t>judgeName</w:t>
-      </w:r>
-      <w:proofErr w:type="spellEnd"/>
-      <w:r>
-        <w:rPr>
-          <w:rFonts w:ascii="Times New Roman" w:hAnsi="Times New Roman" w:cs="Times New Roman (Body CS)"/>
-          <w:b/>
-          <w:bCs/>
-        </w:rPr>
-        <w:t>}}</w:t>
-      </w:r>
-      <w:r>
-        <w:rPr>
-          <w:rFonts w:ascii="Times New Roman" w:hAnsi="Times New Roman" w:cs="Times New Roman (Body CS)"/>
-        </w:rPr>
-        <w:t xml:space="preserve"> on {{</w:t>
-      </w:r>
-      <w:proofErr w:type="spellStart"/>
-      <w:r>
-        <w:rPr>
-          <w:rFonts w:ascii="Times New Roman" w:hAnsi="Times New Roman" w:cs="Times New Roman (Body CS)"/>
-        </w:rPr>
-        <w:t>orderDate</w:t>
-      </w:r>
-      <w:proofErr w:type="spellEnd"/>
-      <w:r>
-        <w:rPr>
-          <w:rFonts w:ascii="Times New Roman" w:hAnsi="Times New Roman" w:cs="Times New Roman (Body CS)"/>
-        </w:rPr>
-        <w:t>}} at a hearing.</w:t>
-      </w:r>
-    </w:p>
-    <w:p>
-      <w:pPr>
-        <w:rPr>
-          <w:rFonts w:ascii="Times New Roman" w:hAnsi="Times New Roman" w:cs="Times New Roman (Body CS)"/>
+          <w:rFonts w:ascii="Arial" w:hAnsi="Arial" w:cs="Arial"/>
         </w:rPr>
       </w:pPr>
     </w:p>
     <w:p>
       <w:pPr>
         <w:rPr>
-          <w:rFonts w:ascii="Times New Roman" w:hAnsi="Times New Roman" w:cs="Times New Roman (Body CS)"/>
+          <w:rFonts w:ascii="Arial" w:hAnsi="Arial" w:cs="Arial"/>
         </w:rPr>
       </w:pPr>
-      <w:r>
-        <w:rPr>
-          <w:rFonts w:ascii="Times New Roman" w:hAnsi="Times New Roman" w:cs="Times New Roman (Body CS)"/>
-        </w:rPr>
-        <w:t>The parties:</w:t>
-      </w:r>
     </w:p>
     <w:p>
       <w:pPr>
         <w:rPr>
-          <w:rFonts w:ascii="Times New Roman" w:hAnsi="Times New Roman" w:cs="Times New Roman (Body CS)"/>
+          <w:rFonts w:ascii="Arial" w:hAnsi="Arial" w:cs="Arial"/>
         </w:rPr>
       </w:pPr>
       <w:r>
         <w:rPr>
-          <w:rFonts w:ascii="Times New Roman" w:hAnsi="Times New Roman" w:cs="Times New Roman (Body CS)"/>
-        </w:rPr>
-        <w:tab/>
-        <w:t xml:space="preserve">The applicant </w:t>
-      </w:r>
-      <w:proofErr w:type="gramStart"/>
-      <w:r>
-        <w:rPr>
-          <w:rFonts w:ascii="Times New Roman" w:hAnsi="Times New Roman" w:cs="Times New Roman (Body CS)"/>
-        </w:rPr>
-        <w:t>is</w:t>
-      </w:r>
-      <w:r>
-        <w:rPr>
-          <w:rFonts w:ascii="Times New Roman" w:hAnsi="Times New Roman" w:cs="Times New Roman (Body CS)"/>
-        </w:rPr>
-        <w:t xml:space="preserve">  </w:t>
-      </w:r>
-      <w:r>
-        <w:rPr>
-          <w:rFonts w:ascii="Times New Roman" w:hAnsi="Times New Roman" w:cs="Times New Roman (Body CS)"/>
-          <w:b/>
-        </w:rPr>
-        <w:t>{</w:t>
-      </w:r>
-      <w:proofErr w:type="gramEnd"/>
-      <w:r>
-        <w:rPr>
-          <w:rFonts w:ascii="Times New Roman" w:hAnsi="Times New Roman" w:cs="Times New Roman (Body CS)"/>
-          <w:b/>
-        </w:rPr>
-        <w:t>{</w:t>
+          <w:rFonts w:ascii="Arial" w:hAnsi="Arial" w:cs="Arial"/>
+        </w:rPr>
+        <w:t>Before {{</w:t>
       </w:r>
       <w:proofErr w:type="spellStart"/>
       <w:r>
         <w:rPr>
-          <w:rFonts w:ascii="Times New Roman" w:hAnsi="Times New Roman" w:cs="Times New Roman (Body CS)"/>
-          <w:b/>
-        </w:rPr>
-        <w:t>applicantName</w:t>
+          <w:rFonts w:ascii="Arial" w:hAnsi="Arial" w:cs="Arial"/>
+        </w:rPr>
+        <w:t>judgeName</w:t>
       </w:r>
       <w:proofErr w:type="spellEnd"/>
       <w:r>
         <w:rPr>
-          <w:rFonts w:ascii="Times New Roman" w:hAnsi="Times New Roman" w:cs="Times New Roman (Body CS)"/>
-          <w:b/>
-        </w:rPr>
-        <w:t>}}</w:t>
-      </w:r>
-      <w:r>
-        <w:rPr>
-          <w:rFonts w:ascii="Times New Roman" w:hAnsi="Times New Roman" w:cs="Times New Roman (Body CS)"/>
-          <w:b/>
-        </w:rPr>
-        <w:t xml:space="preserve"> </w:t>
-      </w:r>
-      <w:r>
-        <w:rPr>
-          <w:rFonts w:ascii="Times New Roman" w:hAnsi="Times New Roman" w:cs="Times New Roman (Body CS)"/>
-        </w:rPr>
-        <w:t>{{</w:t>
+          <w:rFonts w:ascii="Arial" w:hAnsi="Arial" w:cs="Arial"/>
+        </w:rPr>
+        <w:t>}} on {{</w:t>
       </w:r>
       <w:proofErr w:type="spellStart"/>
       <w:r>
         <w:rPr>
-          <w:rFonts w:ascii="Times New Roman" w:hAnsi="Times New Roman" w:cs="Times New Roman (Body CS)"/>
-        </w:rPr>
-        <w:t>applicantRepresentativeClause</w:t>
+          <w:rFonts w:ascii="Arial" w:hAnsi="Arial" w:cs="Arial"/>
+        </w:rPr>
+        <w:t>orderDate</w:t>
       </w:r>
       <w:proofErr w:type="spellEnd"/>
       <w:r>
         <w:rPr>
-          <w:rFonts w:ascii="Times New Roman" w:hAnsi="Times New Roman" w:cs="Times New Roman (Body CS)"/>
-        </w:rPr>
-        <w:t>}}</w:t>
+          <w:rFonts w:ascii="Arial" w:hAnsi="Arial" w:cs="Arial"/>
+        </w:rPr>
+        <w:t>}} at a hearing.</w:t>
       </w:r>
     </w:p>
     <w:p>
       <w:pPr>
         <w:rPr>
-          <w:rFonts w:ascii="Times New Roman" w:hAnsi="Times New Roman" w:cs="Times New Roman (Body CS)"/>
+          <w:rFonts w:ascii="Arial" w:hAnsi="Arial" w:cs="Arial"/>
+        </w:rPr>
+      </w:pPr>
+    </w:p>
+    <w:p>
+      <w:pPr>
+        <w:rPr>
+          <w:rFonts w:ascii="Arial" w:hAnsi="Arial" w:cs="Arial"/>
+        </w:rPr>
+      </w:pPr>
+      <w:r>
+        <w:rPr>
+          <w:rFonts w:ascii="Arial" w:hAnsi="Arial" w:cs="Arial"/>
+        </w:rPr>
+        <w:t>The parties:</w:t>
+      </w:r>
+    </w:p>
+    <w:p>
+      <w:pPr>
+        <w:rPr>
+          <w:rFonts w:ascii="Arial" w:hAnsi="Arial" w:cs="Arial"/>
+        </w:rPr>
+      </w:pPr>
+      <w:r>
+        <w:rPr>
+          <w:rFonts w:ascii="Arial" w:hAnsi="Arial" w:cs="Arial"/>
+        </w:rPr>
+        <w:tab/>
+        <w:t xml:space="preserve">The applicant </w:t>
+      </w:r>
+      <w:proofErr w:type="gramStart"/>
+      <w:r>
+        <w:rPr>
+          <w:rFonts w:ascii="Arial" w:hAnsi="Arial" w:cs="Arial"/>
+        </w:rPr>
+        <w:t>is</w:t>
+      </w:r>
+      <w:r>
+        <w:rPr>
+          <w:rFonts w:ascii="Arial" w:hAnsi="Arial" w:cs="Arial"/>
+        </w:rPr>
+        <w:t xml:space="preserve">  </w:t>
+      </w:r>
+      <w:r>
+        <w:rPr>
+          <w:rFonts w:ascii="Arial" w:hAnsi="Arial" w:cs="Arial"/>
+        </w:rPr>
+        <w:t>{</w:t>
+      </w:r>
+      <w:proofErr w:type="gramEnd"/>
+      <w:r>
+        <w:rPr>
+          <w:rFonts w:ascii="Arial" w:hAnsi="Arial" w:cs="Arial"/>
+        </w:rPr>
+        <w:t>{</w:t>
+      </w:r>
+      <w:proofErr w:type="spellStart"/>
+      <w:r>
+        <w:rPr>
+          <w:rFonts w:ascii="Arial" w:hAnsi="Arial" w:cs="Arial"/>
+        </w:rPr>
+        <w:t>applicantName</w:t>
+      </w:r>
+      <w:proofErr w:type="spellEnd"/>
+      <w:r>
+        <w:rPr>
+          <w:rFonts w:ascii="Arial" w:hAnsi="Arial" w:cs="Arial"/>
+        </w:rPr>
+        <w:t>}}</w:t>
+      </w:r>
+      <w:r>
+        <w:rPr>
+          <w:rFonts w:ascii="Arial" w:hAnsi="Arial" w:cs="Arial"/>
+        </w:rPr>
+        <w:t xml:space="preserve"> </w:t>
+      </w:r>
+      <w:r>
+        <w:rPr>
+          <w:rFonts w:ascii="Arial" w:hAnsi="Arial" w:cs="Arial"/>
+        </w:rPr>
+        <w:t>{{</w:t>
+      </w:r>
+      <w:proofErr w:type="spellStart"/>
+      <w:r>
+        <w:rPr>
+          <w:rFonts w:ascii="Arial" w:hAnsi="Arial" w:cs="Arial"/>
+        </w:rPr>
+        <w:t>applicantRepresentativeClause</w:t>
+      </w:r>
+      <w:proofErr w:type="spellEnd"/>
+      <w:r>
+        <w:rPr>
+          <w:rFonts w:ascii="Arial" w:hAnsi="Arial" w:cs="Arial"/>
+        </w:rPr>
+        <w:t>}}</w:t>
+      </w:r>
+    </w:p>
+    <w:p>
+      <w:pPr>
+        <w:rPr>
+          <w:rFonts w:ascii="Arial" w:hAnsi="Arial" w:cs="Arial"/>
         </w:rPr>
       </w:pPr>
     </w:p>
@@ -814,66 +867,52 @@
           <w:p>
             <w:pPr>
               <w:rPr>
-                <w:rFonts w:ascii="Times New Roman" w:hAnsi="Times New Roman" w:cs="Times New Roman (Body CS)"/>
-              </w:rPr>
-            </w:pPr>
-            <w:r>
-              <w:rPr>
-                <w:rFonts w:ascii="Times New Roman" w:hAnsi="Times New Roman" w:cs="Times New Roman (Body CS)"/>
+                <w:rFonts w:ascii="Arial" w:hAnsi="Arial" w:cs="Arial"/>
+              </w:rPr>
+            </w:pPr>
+            <w:r>
+              <w:rPr>
+                <w:rFonts w:ascii="Arial" w:hAnsi="Arial" w:cs="Arial"/>
               </w:rPr>
               <w:t>{{respondents</w:t>
             </w:r>
             <w:proofErr w:type="gramStart"/>
             <w:r>
               <w:rPr>
-                <w:rFonts w:ascii="Times New Roman" w:hAnsi="Times New Roman" w:cs="Times New Roman (Body CS)"/>
+                <w:rFonts w:ascii="Arial" w:hAnsi="Arial" w:cs="Arial"/>
               </w:rPr>
               <w:t>}}The</w:t>
             </w:r>
             <w:proofErr w:type="gramEnd"/>
             <w:r>
               <w:rPr>
-                <w:rFonts w:ascii="Times New Roman" w:hAnsi="Times New Roman" w:cs="Times New Roman (Body CS)"/>
-              </w:rPr>
-              <w:t xml:space="preserve"> [ordinal] respondent is [</w:t>
-            </w:r>
-            <w:r>
-              <w:rPr>
-                <w:rFonts w:ascii="Times New Roman" w:hAnsi="Times New Roman" w:cs="Times New Roman (Body CS)"/>
-                <w:b/>
-                <w:bCs/>
-              </w:rPr>
-              <w:t>name</w:t>
-            </w:r>
-            <w:r>
-              <w:rPr>
-                <w:rFonts w:ascii="Times New Roman" w:hAnsi="Times New Roman" w:cs="Times New Roman (Body CS)"/>
-              </w:rPr>
-              <w:t>], the [relationship]</w:t>
-            </w:r>
-            <w:r>
-              <w:rPr>
-                <w:rFonts w:ascii="Times New Roman" w:hAnsi="Times New Roman" w:cs="Times New Roman (Body CS)"/>
+                <w:rFonts w:ascii="Arial" w:hAnsi="Arial" w:cs="Arial"/>
+              </w:rPr>
+              <w:t xml:space="preserve"> [ordinal] respondent is [name], the [relationship]</w:t>
+            </w:r>
+            <w:r>
+              <w:rPr>
+                <w:rFonts w:ascii="Arial" w:hAnsi="Arial" w:cs="Arial"/>
               </w:rPr>
               <w:t xml:space="preserve"> </w:t>
             </w:r>
             <w:r>
               <w:rPr>
-                <w:rFonts w:ascii="Times New Roman" w:hAnsi="Times New Roman" w:cs="Times New Roman (Body CS)"/>
+                <w:rFonts w:ascii="Arial" w:hAnsi="Arial" w:cs="Arial"/>
               </w:rPr>
               <w:t>[</w:t>
             </w:r>
             <w:proofErr w:type="spellStart"/>
             <w:r>
               <w:rPr>
-                <w:rFonts w:ascii="Times New Roman" w:hAnsi="Times New Roman" w:cs="Times New Roman (Body CS)"/>
+                <w:rFonts w:ascii="Arial" w:hAnsi="Arial" w:cs="Arial"/>
               </w:rPr>
               <w:t>representativeClause</w:t>
             </w:r>
             <w:proofErr w:type="spellEnd"/>
             <w:r>
               <w:rPr>
-                <w:rFonts w:ascii="Times New Roman" w:hAnsi="Times New Roman" w:cs="Times New Roman (Body CS)"/>
+                <w:rFonts w:ascii="Arial" w:hAnsi="Arial" w:cs="Arial"/>
               </w:rPr>
               <w:t>]</w:t>
             </w:r>
@@ -884,33 +923,33 @@
     <w:p>
       <w:pPr>
         <w:rPr>
-          <w:rFonts w:ascii="Times New Roman" w:hAnsi="Times New Roman" w:cs="Times New Roman (Body CS)"/>
+          <w:rFonts w:ascii="Arial" w:hAnsi="Arial" w:cs="Arial"/>
         </w:rPr>
       </w:pPr>
     </w:p>
     <w:p>
       <w:pPr>
         <w:rPr>
-          <w:rFonts w:ascii="Times New Roman" w:hAnsi="Times New Roman" w:cs="Times New Roman (Body CS)"/>
+          <w:rFonts w:ascii="Arial" w:hAnsi="Arial" w:cs="Arial"/>
         </w:rPr>
       </w:pPr>
       <w:r>
         <w:rPr>
-          <w:rFonts w:ascii="Times New Roman" w:hAnsi="Times New Roman" w:cs="Times New Roman (Body CS)"/>
+          <w:rFonts w:ascii="Arial" w:hAnsi="Arial" w:cs="Arial"/>
         </w:rPr>
         <w:t>{{</w:t>
       </w:r>
       <w:proofErr w:type="spellStart"/>
       <w:r>
         <w:rPr>
-          <w:rFonts w:ascii="Times New Roman" w:hAnsi="Times New Roman" w:cs="Times New Roman (Body CS)"/>
+          <w:rFonts w:ascii="Arial" w:hAnsi="Arial" w:cs="Arial"/>
         </w:rPr>
         <w:t>appointedGuardianClause</w:t>
       </w:r>
       <w:proofErr w:type="spellEnd"/>
       <w:r>
         <w:rPr>
-          <w:rFonts w:ascii="Times New Roman" w:hAnsi="Times New Roman" w:cs="Times New Roman (Body CS)"/>
+          <w:rFonts w:ascii="Arial" w:hAnsi="Arial" w:cs="Arial"/>
         </w:rPr>
         <w:t>}}</w:t>
       </w:r>
@@ -918,33 +957,33 @@
     <w:p>
       <w:pPr>
         <w:rPr>
-          <w:rFonts w:ascii="Times New Roman" w:hAnsi="Times New Roman" w:cs="Times New Roman (Body CS)"/>
+          <w:rFonts w:ascii="Arial" w:hAnsi="Arial" w:cs="Arial"/>
         </w:rPr>
       </w:pPr>
     </w:p>
     <w:p>
       <w:pPr>
         <w:rPr>
-          <w:rFonts w:ascii="Times New Roman" w:hAnsi="Times New Roman" w:cs="Times New Roman (Body CS)"/>
+          <w:rFonts w:ascii="Arial" w:hAnsi="Arial" w:cs="Arial"/>
         </w:rPr>
       </w:pPr>
       <w:r>
         <w:rPr>
-          <w:rFonts w:ascii="Times New Roman" w:hAnsi="Times New Roman" w:cs="Times New Roman (Body CS)"/>
+          <w:rFonts w:ascii="Arial" w:hAnsi="Arial" w:cs="Arial"/>
         </w:rPr>
         <w:t>{{</w:t>
       </w:r>
       <w:proofErr w:type="spellStart"/>
       <w:r>
         <w:rPr>
-          <w:rFonts w:ascii="Times New Roman" w:hAnsi="Times New Roman" w:cs="Times New Roman (Body CS)"/>
+          <w:rFonts w:ascii="Arial" w:hAnsi="Arial" w:cs="Arial"/>
         </w:rPr>
         <w:t>futureHearingClause</w:t>
       </w:r>
       <w:proofErr w:type="spellEnd"/>
       <w:r>
         <w:rPr>
-          <w:rFonts w:ascii="Times New Roman" w:hAnsi="Times New Roman" w:cs="Times New Roman (Body CS)"/>
+          <w:rFonts w:ascii="Arial" w:hAnsi="Arial" w:cs="Arial"/>
         </w:rPr>
         <w:t>}}</w:t>
       </w:r>
@@ -952,7 +991,7 @@
     <w:p>
       <w:pPr>
         <w:rPr>
-          <w:rFonts w:ascii="Times New Roman" w:hAnsi="Times New Roman" w:cs="Times New Roman (Body CS)"/>
+          <w:rFonts w:ascii="Arial" w:hAnsi="Arial" w:cs="Arial"/>
         </w:rPr>
       </w:pPr>
     </w:p>

</xml_diff>

<commit_message>
FPVTL-2249 add family man number, if it's entered to the top right of the custom order header, just under the ccd case number.
</commit_message>
<xml_diff>
--- a/src/main/resources/templates/CustomOrderHeader.docx
+++ b/src/main/resources/templates/CustomOrderHeader.docx
@@ -1,5 +1,1041 @@
 
 <file path=word/document.xml><?xml version="1.0" encoding="utf-8"?>
+<w:document xmlns:wpc="http://schemas.microsoft.com/office/word/2010/wordprocessingCanvas" xmlns:cx="http://schemas.microsoft.com/office/drawing/2014/chartex" xmlns:cx1="http://schemas.microsoft.com/office/drawing/2015/9/8/chartex" xmlns:cx2="http://schemas.microsoft.com/office/drawing/2015/10/21/chartex" xmlns:cx3="http://schemas.microsoft.com/office/drawing/2016/5/9/chartex" xmlns:cx4="http://schemas.microsoft.com/office/drawing/2016/5/10/chartex" xmlns:cx5="http://schemas.microsoft.com/office/drawing/2016/5/11/chartex" xmlns:cx6="http://schemas.microsoft.com/office/drawing/2016/5/12/chartex" xmlns:cx7="http://schemas.microsoft.com/office/drawing/2016/5/13/chartex" xmlns:cx8="http://schemas.microsoft.com/office/drawing/2016/5/14/chartex" xmlns:mc="http://schemas.openxmlformats.org/markup-compatibility/2006" xmlns:aink="http://schemas.microsoft.com/office/drawing/2016/ink" xmlns:am3d="http://schemas.microsoft.com/office/drawing/2017/model3d" xmlns:o="urn:schemas-microsoft-com:office:office" xmlns:oel="http://schemas.microsoft.com/office/2019/extlst" xmlns:r="http://schemas.openxmlformats.org/officeDocument/2006/relationships" xmlns:m="http://schemas.openxmlformats.org/officeDocument/2006/math" xmlns:v="urn:schemas-microsoft-com:vml" xmlns:wp14="http://schemas.microsoft.com/office/word/2010/wordprocessingDrawing" xmlns:wp="http://schemas.openxmlformats.org/drawingml/2006/wordprocessingDrawing" xmlns:w10="urn:schemas-microsoft-com:office:word" xmlns:w="http://schemas.openxmlformats.org/wordprocessingml/2006/main" xmlns:w14="http://schemas.microsoft.com/office/word/2010/wordml" xmlns:w15="http://schemas.microsoft.com/office/word/2012/wordml" xmlns:w16cex="http://schemas.microsoft.com/office/word/2018/wordml/cex" xmlns:w16cid="http://schemas.microsoft.com/office/word/2016/wordml/cid" xmlns:w16="http://schemas.microsoft.com/office/word/2018/wordml" xmlns:w16sdtdh="http://schemas.microsoft.com/office/word/2020/wordml/sdtdatahash" xmlns:w16se="http://schemas.microsoft.com/office/word/2015/wordml/symex" xmlns:wpg="http://schemas.microsoft.com/office/word/2010/wordprocessingGroup" xmlns:wpi="http://schemas.microsoft.com/office/word/2010/wordprocessingInk" xmlns:wne="http://schemas.microsoft.com/office/word/2006/wordml" xmlns:wps="http://schemas.microsoft.com/office/word/2010/wordprocessingShape" mc:Ignorable="w14 w15 w16se w16cid w16 w16cex w16sdtdh wp14">
+  <w:body>
+    <w:tbl>
+      <w:tblPr>
+        <w:tblStyle w:val="TableGrid"/>
+        <w:tblW w:w="0" w:type="auto"/>
+        <w:tblBorders>
+          <w:top w:val="none" w:sz="0" w:space="0" w:color="auto"/>
+          <w:left w:val="none" w:sz="0" w:space="0" w:color="auto"/>
+          <w:bottom w:val="none" w:sz="0" w:space="0" w:color="auto"/>
+          <w:right w:val="none" w:sz="0" w:space="0" w:color="auto"/>
+          <w:insideH w:val="none" w:sz="0" w:space="0" w:color="auto"/>
+          <w:insideV w:val="none" w:sz="0" w:space="0" w:color="auto"/>
+        </w:tblBorders>
+        <w:tblLook w:val="04A0" w:firstRow="1" w:lastRow="0" w:firstColumn="1" w:lastColumn="0" w:noHBand="0" w:noVBand="1"/>
+      </w:tblPr>
+      <w:tblGrid>
+        <w:gridCol w:w="1563"/>
+        <w:gridCol w:w="3824"/>
+        <w:gridCol w:w="3639"/>
+      </w:tblGrid>
+      <w:tr>
+        <w:trPr>
+          <w:trHeight w:val="1121"/>
+        </w:trPr>
+        <w:tc>
+          <w:tcPr>
+            <w:tcW w:w="1563" w:type="dxa"/>
+          </w:tcPr>
+          <w:p>
+            <w:pPr>
+              <w:rPr>
+                <w:rFonts w:ascii="Arial" w:hAnsi="Arial" w:cs="Arial"/>
+              </w:rPr>
+            </w:pPr>
+            <w:r>
+              <w:rPr>
+                <w:rFonts w:ascii="Arial" w:hAnsi="Arial" w:cs="Arial"/>
+                <w:noProof/>
+              </w:rPr>
+              <w:drawing>
+                <wp:inline distT="0" distB="0" distL="0" distR="0" wp14:anchorId="19327A42" wp14:editId="3562D081">
+                  <wp:extent cx="855573" cy="712381"/>
+                  <wp:effectExtent l="0" t="0" r="0" b="0"/>
+                  <wp:docPr id="2" name="Picture 2" descr="A black and white logo&#10;&#10;Description automatically generated"/>
+                  <wp:cNvGraphicFramePr>
+                    <a:graphicFrameLocks xmlns:a="http://schemas.openxmlformats.org/drawingml/2006/main" noChangeAspect="1"/>
+                  </wp:cNvGraphicFramePr>
+                  <a:graphic xmlns:a="http://schemas.openxmlformats.org/drawingml/2006/main">
+                    <a:graphicData uri="http://schemas.openxmlformats.org/drawingml/2006/picture">
+                      <pic:pic xmlns:pic="http://schemas.openxmlformats.org/drawingml/2006/picture">
+                        <pic:nvPicPr>
+                          <pic:cNvPr id="2" name="Picture 2" descr="A black and white logo&#10;&#10;Description automatically generated"/>
+                          <pic:cNvPicPr/>
+                        </pic:nvPicPr>
+                        <pic:blipFill>
+                          <a:blip r:embed="rId4" cstate="print">
+                            <a:extLst>
+                              <a:ext uri="{28A0092B-C50C-407E-A947-70E740481C1C}">
+                                <a14:useLocalDpi xmlns:a14="http://schemas.microsoft.com/office/drawing/2010/main" val="0"/>
+                              </a:ext>
+                            </a:extLst>
+                          </a:blip>
+                          <a:stretch>
+                            <a:fillRect/>
+                          </a:stretch>
+                        </pic:blipFill>
+                        <pic:spPr>
+                          <a:xfrm>
+                            <a:off x="0" y="0"/>
+                            <a:ext cx="950185" cy="791158"/>
+                          </a:xfrm>
+                          <a:prstGeom prst="rect">
+                            <a:avLst/>
+                          </a:prstGeom>
+                        </pic:spPr>
+                      </pic:pic>
+                    </a:graphicData>
+                  </a:graphic>
+                </wp:inline>
+              </w:drawing>
+            </w:r>
+          </w:p>
+        </w:tc>
+        <w:tc>
+          <w:tcPr>
+            <w:tcW w:w="3824" w:type="dxa"/>
+          </w:tcPr>
+          <w:p>
+            <w:pPr>
+              <w:rPr>
+                <w:rFonts w:ascii="Arial" w:hAnsi="Arial" w:cs="Arial"/>
+                <w:sz w:val="32"/>
+                <w:szCs w:val="28"/>
+              </w:rPr>
+            </w:pPr>
+            <w:r>
+              <w:rPr>
+                <w:rFonts w:ascii="Arial" w:hAnsi="Arial" w:cs="Arial"/>
+                <w:sz w:val="32"/>
+                <w:szCs w:val="28"/>
+              </w:rPr>
+              <w:t>In the Family Court</w:t>
+            </w:r>
+          </w:p>
+          <w:p>
+            <w:pPr>
+              <w:rPr>
+                <w:rFonts w:ascii="Arial" w:hAnsi="Arial" w:cs="Arial"/>
+                <w:sz w:val="32"/>
+              </w:rPr>
+            </w:pPr>
+            <w:r>
+              <w:rPr>
+                <w:rFonts w:ascii="Arial" w:hAnsi="Arial" w:cs="Arial"/>
+                <w:sz w:val="32"/>
+                <w:szCs w:val="28"/>
+              </w:rPr>
+              <w:t xml:space="preserve">sitting at </w:t>
+            </w:r>
+            <w:r>
+              <w:rPr>
+                <w:rFonts w:ascii="Arial" w:hAnsi="Arial" w:cs="Arial"/>
+                <w:sz w:val="32"/>
+              </w:rPr>
+              <w:t>{{</w:t>
+            </w:r>
+            <w:proofErr w:type="spellStart"/>
+            <w:r>
+              <w:rPr>
+                <w:rFonts w:ascii="Arial" w:hAnsi="Arial" w:cs="Arial"/>
+                <w:sz w:val="32"/>
+              </w:rPr>
+              <w:t>courtName</w:t>
+            </w:r>
+            <w:proofErr w:type="spellEnd"/>
+            <w:r>
+              <w:rPr>
+                <w:rFonts w:ascii="Arial" w:hAnsi="Arial" w:cs="Arial"/>
+                <w:sz w:val="32"/>
+              </w:rPr>
+              <w:t>}}</w:t>
+            </w:r>
+          </w:p>
+          <w:p>
+            <w:pPr>
+              <w:rPr>
+                <w:rFonts w:ascii="Arial" w:hAnsi="Arial" w:cs="Arial"/>
+                <w:sz w:val="32"/>
+                <w:szCs w:val="28"/>
+              </w:rPr>
+            </w:pPr>
+          </w:p>
+        </w:tc>
+        <w:tc>
+          <w:tcPr>
+            <w:tcW w:w="3639" w:type="dxa"/>
+          </w:tcPr>
+          <w:p>
+            <w:pPr>
+              <w:rPr>
+                <w:rFonts w:ascii="Arial" w:hAnsi="Arial" w:cs="Arial"/>
+                <w:sz w:val="32"/>
+              </w:rPr>
+            </w:pPr>
+            <w:r>
+              <w:rPr>
+                <w:rFonts w:ascii="Arial" w:hAnsi="Arial" w:cs="Arial"/>
+                <w:sz w:val="32"/>
+              </w:rPr>
+              <w:t>Case No:</w:t>
+            </w:r>
+          </w:p>
+          <w:p>
+            <w:pPr>
+              <w:rPr>
+                <w:rFonts w:ascii="Arial" w:hAnsi="Arial" w:cs="Arial"/>
+                <w:sz w:val="32"/>
+              </w:rPr>
+            </w:pPr>
+            <w:r>
+              <w:rPr>
+                <w:rFonts w:ascii="Arial" w:hAnsi="Arial" w:cs="Arial"/>
+                <w:sz w:val="32"/>
+              </w:rPr>
+              <w:t>{{</w:t>
+            </w:r>
+            <w:proofErr w:type="spellStart"/>
+            <w:r>
+              <w:rPr>
+                <w:rFonts w:ascii="Arial" w:hAnsi="Arial" w:cs="Arial"/>
+                <w:sz w:val="32"/>
+              </w:rPr>
+              <w:t>caseNumber</w:t>
+            </w:r>
+            <w:proofErr w:type="spellEnd"/>
+            <w:r>
+              <w:rPr>
+                <w:rFonts w:ascii="Arial" w:hAnsi="Arial" w:cs="Arial"/>
+                <w:sz w:val="32"/>
+              </w:rPr>
+              <w:t>}}</w:t>
+            </w:r>
+          </w:p>
+          <w:p w14:paraId="FM000001" w14:textId="FM000001">
+            <w:pPr>
+              <w:rPr>
+                <w:rFonts w:ascii="Arial" w:hAnsi="Arial" w:cs="Arial"/>
+                <w:sz w:val="32"/>
+              </w:rPr>
+            </w:pPr>
+            <w:r>
+              <w:rPr>
+                <w:rFonts w:ascii="Arial" w:hAnsi="Arial" w:cs="Arial"/>
+                <w:sz w:val="32"/>
+              </w:rPr>
+              <w:t>{{familymanLabel}}</w:t>
+            </w:r>
+          </w:p>
+          <w:p w14:paraId="FM000002" w14:textId="FM000002">
+            <w:pPr>
+              <w:rPr>
+                <w:rFonts w:ascii="Arial" w:hAnsi="Arial" w:cs="Arial"/>
+                <w:sz w:val="32"/>
+              </w:rPr>
+            </w:pPr>
+            <w:r>
+              <w:rPr>
+                <w:rFonts w:ascii="Arial" w:hAnsi="Arial" w:cs="Arial"/>
+                <w:sz w:val="32"/>
+              </w:rPr>
+              <w:t>{{familymanCaseNumber}}</w:t>
+            </w:r>
+          </w:p>
+          <w:p>
+            <w:pPr>
+              <w:rPr>
+                <w:rFonts w:ascii="Arial" w:hAnsi="Arial" w:cs="Arial"/>
+                <w:sz w:val="32"/>
+              </w:rPr>
+            </w:pPr>
+          </w:p>
+        </w:tc>
+      </w:tr>
+    </w:tbl>
+    <w:tbl>
+      <w:tblPr>
+        <w:tblW w:w="9010" w:type="dxa"/>
+        <w:tblInd w:w="108" w:type="dxa"/>
+        <w:tblBorders>
+          <w:top w:val="single" w:sz="4" w:space="0" w:color="000000"/>
+          <w:left w:val="nil"/>
+          <w:bottom w:val="single" w:sz="4" w:space="0" w:color="000000"/>
+          <w:right w:val="nil"/>
+          <w:insideH w:val="nil"/>
+          <w:insideV w:val="nil"/>
+        </w:tblBorders>
+        <w:tblLayout w:type="fixed"/>
+        <w:tblLook w:val="0400" w:firstRow="0" w:lastRow="0" w:firstColumn="0" w:lastColumn="0" w:noHBand="0" w:noVBand="1"/>
+      </w:tblPr>
+      <w:tblGrid>
+        <w:gridCol w:w="1418"/>
+        <w:gridCol w:w="3118"/>
+        <w:gridCol w:w="2221"/>
+        <w:gridCol w:w="2253"/>
+      </w:tblGrid>
+      <w:tr>
+        <w:tc>
+          <w:tcPr>
+            <w:tcW w:w="1418" w:type="dxa"/>
+          </w:tcPr>
+          <w:p>
+            <w:pPr>
+              <w:rPr>
+                <w:rFonts w:ascii="Arial" w:hAnsi="Arial" w:cs="Arial"/>
+              </w:rPr>
+            </w:pPr>
+          </w:p>
+        </w:tc>
+        <w:tc>
+          <w:tcPr>
+            <w:tcW w:w="7592" w:type="dxa"/>
+            <w:gridSpan w:val="3"/>
+            <w:tcBorders>
+              <w:top w:val="single" w:sz="4" w:space="0" w:color="000000"/>
+              <w:bottom w:val="single" w:sz="4" w:space="0" w:color="000000"/>
+            </w:tcBorders>
+            <w:tcMar>
+              <w:top w:w="57" w:type="dxa"/>
+              <w:bottom w:w="57" w:type="dxa"/>
+            </w:tcMar>
+            <w:vAlign w:val="center"/>
+          </w:tcPr>
+          <w:p>
+            <w:pPr>
+              <w:rPr>
+                <w:rFonts w:ascii="Arial" w:hAnsi="Arial" w:cs="Arial"/>
+              </w:rPr>
+            </w:pPr>
+            <w:r>
+              <w:rPr>
+                <w:rFonts w:ascii="Arial" w:hAnsi="Arial" w:cs="Arial"/>
+              </w:rPr>
+              <w:t>Order</w:t>
+            </w:r>
+          </w:p>
+          <w:p>
+            <w:pPr>
+              <w:rPr>
+                <w:rFonts w:ascii="Arial" w:hAnsi="Arial" w:cs="Arial"/>
+              </w:rPr>
+            </w:pPr>
+            <w:r>
+              <w:rPr>
+                <w:rFonts w:ascii="Arial" w:hAnsi="Arial" w:cs="Arial"/>
+              </w:rPr>
+              <w:t>{{</w:t>
+            </w:r>
+            <w:proofErr w:type="spellStart"/>
+            <w:r>
+              <w:rPr>
+                <w:rFonts w:ascii="Arial" w:hAnsi="Arial" w:cs="Arial"/>
+              </w:rPr>
+              <w:t>orderName</w:t>
+            </w:r>
+            <w:proofErr w:type="spellEnd"/>
+            <w:r>
+              <w:rPr>
+                <w:rFonts w:ascii="Arial" w:hAnsi="Arial" w:cs="Arial"/>
+              </w:rPr>
+              <w:t>}}</w:t>
+            </w:r>
+          </w:p>
+        </w:tc>
+      </w:tr>
+      <w:tr>
+        <w:tc>
+          <w:tcPr>
+            <w:tcW w:w="1418" w:type="dxa"/>
+          </w:tcPr>
+          <w:p>
+            <w:pPr>
+              <w:rPr>
+                <w:rFonts w:ascii="Arial" w:hAnsi="Arial" w:cs="Arial"/>
+              </w:rPr>
+            </w:pPr>
+          </w:p>
+        </w:tc>
+        <w:tc>
+          <w:tcPr>
+            <w:tcW w:w="3118" w:type="dxa"/>
+            <w:tcBorders>
+              <w:top w:val="single" w:sz="4" w:space="0" w:color="000000"/>
+            </w:tcBorders>
+          </w:tcPr>
+          <w:p>
+            <w:pPr>
+              <w:rPr>
+                <w:rFonts w:ascii="Arial" w:hAnsi="Arial" w:cs="Arial"/>
+              </w:rPr>
+            </w:pPr>
+          </w:p>
+        </w:tc>
+        <w:tc>
+          <w:tcPr>
+            <w:tcW w:w="2221" w:type="dxa"/>
+            <w:tcBorders>
+              <w:top w:val="single" w:sz="4" w:space="0" w:color="000000"/>
+            </w:tcBorders>
+          </w:tcPr>
+          <w:p>
+            <w:pPr>
+              <w:rPr>
+                <w:rFonts w:ascii="Arial" w:hAnsi="Arial" w:cs="Arial"/>
+              </w:rPr>
+            </w:pPr>
+          </w:p>
+        </w:tc>
+        <w:tc>
+          <w:tcPr>
+            <w:tcW w:w="2253" w:type="dxa"/>
+            <w:tcBorders>
+              <w:top w:val="single" w:sz="4" w:space="0" w:color="000000"/>
+            </w:tcBorders>
+          </w:tcPr>
+          <w:p>
+            <w:pPr>
+              <w:rPr>
+                <w:rFonts w:ascii="Arial" w:hAnsi="Arial" w:cs="Arial"/>
+              </w:rPr>
+            </w:pPr>
+          </w:p>
+        </w:tc>
+      </w:tr>
+      <w:tr>
+        <w:tc>
+          <w:tcPr>
+            <w:tcW w:w="1418" w:type="dxa"/>
+          </w:tcPr>
+          <w:p>
+            <w:pPr>
+              <w:rPr>
+                <w:rFonts w:ascii="Arial" w:hAnsi="Arial" w:cs="Arial"/>
+              </w:rPr>
+            </w:pPr>
+          </w:p>
+        </w:tc>
+        <w:tc>
+          <w:tcPr>
+            <w:tcW w:w="3118" w:type="dxa"/>
+          </w:tcPr>
+          <w:p>
+            <w:pPr>
+              <w:rPr>
+                <w:rFonts w:ascii="Arial" w:hAnsi="Arial" w:cs="Arial"/>
+              </w:rPr>
+            </w:pPr>
+            <w:r>
+              <w:rPr>
+                <w:rFonts w:ascii="Arial" w:hAnsi="Arial" w:cs="Arial"/>
+              </w:rPr>
+              <w:t>The full name(s) of the child(ren)</w:t>
+            </w:r>
+          </w:p>
+        </w:tc>
+        <w:tc>
+          <w:tcPr>
+            <w:tcW w:w="2221" w:type="dxa"/>
+          </w:tcPr>
+          <w:p>
+            <w:pPr>
+              <w:rPr>
+                <w:rFonts w:ascii="Arial" w:hAnsi="Arial" w:cs="Arial"/>
+              </w:rPr>
+            </w:pPr>
+            <w:r>
+              <w:rPr>
+                <w:rFonts w:ascii="Arial" w:hAnsi="Arial" w:cs="Arial"/>
+              </w:rPr>
+              <w:t>Sex</w:t>
+            </w:r>
+          </w:p>
+        </w:tc>
+        <w:tc>
+          <w:tcPr>
+            <w:tcW w:w="2253" w:type="dxa"/>
+          </w:tcPr>
+          <w:p>
+            <w:pPr>
+              <w:rPr>
+                <w:rFonts w:ascii="Arial" w:hAnsi="Arial" w:cs="Arial"/>
+              </w:rPr>
+            </w:pPr>
+            <w:r>
+              <w:rPr>
+                <w:rFonts w:ascii="Arial" w:hAnsi="Arial" w:cs="Arial"/>
+              </w:rPr>
+              <w:t>Date(s) of Birth</w:t>
+            </w:r>
+          </w:p>
+        </w:tc>
+      </w:tr>
+      <w:tr>
+        <w:trPr>
+          <w:trHeight w:val="403"/>
+        </w:trPr>
+        <w:tc>
+          <w:tcPr>
+            <w:tcW w:w="1418" w:type="dxa"/>
+          </w:tcPr>
+          <w:p>
+            <w:pPr>
+              <w:rPr>
+                <w:rFonts w:ascii="Arial" w:hAnsi="Arial" w:cs="Arial"/>
+              </w:rPr>
+            </w:pPr>
+          </w:p>
+        </w:tc>
+        <w:tc>
+          <w:tcPr>
+            <w:tcW w:w="3118" w:type="dxa"/>
+          </w:tcPr>
+          <w:p>
+            <w:pPr>
+              <w:rPr>
+                <w:rFonts w:ascii="Arial" w:hAnsi="Arial" w:cs="Arial"/>
+              </w:rPr>
+            </w:pPr>
+          </w:p>
+        </w:tc>
+        <w:tc>
+          <w:tcPr>
+            <w:tcW w:w="2221" w:type="dxa"/>
+          </w:tcPr>
+          <w:p>
+            <w:pPr>
+              <w:rPr>
+                <w:rFonts w:ascii="Arial" w:hAnsi="Arial" w:cs="Arial"/>
+              </w:rPr>
+            </w:pPr>
+          </w:p>
+        </w:tc>
+        <w:tc>
+          <w:tcPr>
+            <w:tcW w:w="2253" w:type="dxa"/>
+          </w:tcPr>
+          <w:p>
+            <w:pPr>
+              <w:rPr>
+                <w:rFonts w:ascii="Arial" w:hAnsi="Arial" w:cs="Arial"/>
+              </w:rPr>
+            </w:pPr>
+          </w:p>
+        </w:tc>
+      </w:tr>
+      <w:tr>
+        <w:trPr>
+          <w:trHeight w:val="403"/>
+        </w:trPr>
+        <w:tc>
+          <w:tcPr>
+            <w:tcW w:w="1418" w:type="dxa"/>
+          </w:tcPr>
+          <w:p>
+            <w:pPr>
+              <w:rPr>
+                <w:rFonts w:ascii="Arial" w:hAnsi="Arial" w:cs="Arial"/>
+              </w:rPr>
+            </w:pPr>
+          </w:p>
+        </w:tc>
+        <w:tc>
+          <w:tcPr>
+            <w:tcW w:w="3118" w:type="dxa"/>
+          </w:tcPr>
+          <w:p>
+            <w:pPr>
+              <w:rPr>
+                <w:rFonts w:ascii="Arial" w:hAnsi="Arial" w:cs="Arial"/>
+              </w:rPr>
+            </w:pPr>
+            <w:r>
+              <w:rPr>
+                <w:rFonts w:ascii="Arial" w:hAnsi="Arial" w:cs="Arial"/>
+              </w:rPr>
+              <w:t>{{children</w:t>
+            </w:r>
+            <w:proofErr w:type="gramStart"/>
+            <w:r>
+              <w:rPr>
+                <w:rFonts w:ascii="Arial" w:hAnsi="Arial" w:cs="Arial"/>
+              </w:rPr>
+              <w:t>}}[</w:t>
+            </w:r>
+            <w:proofErr w:type="spellStart"/>
+            <w:proofErr w:type="gramEnd"/>
+            <w:r>
+              <w:rPr>
+                <w:rFonts w:ascii="Arial" w:hAnsi="Arial" w:cs="Arial"/>
+              </w:rPr>
+              <w:t>fullName</w:t>
+            </w:r>
+            <w:proofErr w:type="spellEnd"/>
+            <w:r>
+              <w:rPr>
+                <w:rFonts w:ascii="Arial" w:hAnsi="Arial" w:cs="Arial"/>
+              </w:rPr>
+              <w:t>]</w:t>
+            </w:r>
+          </w:p>
+        </w:tc>
+        <w:tc>
+          <w:tcPr>
+            <w:tcW w:w="2221" w:type="dxa"/>
+          </w:tcPr>
+          <w:p>
+            <w:pPr>
+              <w:rPr>
+                <w:rFonts w:ascii="Arial" w:hAnsi="Arial" w:cs="Arial"/>
+              </w:rPr>
+            </w:pPr>
+            <w:r>
+              <w:rPr>
+                <w:rFonts w:ascii="Arial" w:hAnsi="Arial" w:cs="Arial"/>
+              </w:rPr>
+              <w:t>[gender]</w:t>
+            </w:r>
+          </w:p>
+        </w:tc>
+        <w:tc>
+          <w:tcPr>
+            <w:tcW w:w="2253" w:type="dxa"/>
+          </w:tcPr>
+          <w:p>
+            <w:pPr>
+              <w:rPr>
+                <w:rFonts w:ascii="Arial" w:hAnsi="Arial" w:cs="Arial"/>
+              </w:rPr>
+            </w:pPr>
+            <w:r>
+              <w:rPr>
+                <w:rFonts w:ascii="Arial" w:hAnsi="Arial" w:cs="Arial"/>
+              </w:rPr>
+              <w:t>[dob]</w:t>
+            </w:r>
+          </w:p>
+        </w:tc>
+      </w:tr>
+      <w:tr>
+        <w:tc>
+          <w:tcPr>
+            <w:tcW w:w="1418" w:type="dxa"/>
+          </w:tcPr>
+          <w:p>
+            <w:pPr>
+              <w:rPr>
+                <w:rFonts w:ascii="Arial" w:hAnsi="Arial" w:cs="Arial"/>
+              </w:rPr>
+            </w:pPr>
+          </w:p>
+        </w:tc>
+        <w:tc>
+          <w:tcPr>
+            <w:tcW w:w="3118" w:type="dxa"/>
+          </w:tcPr>
+          <w:p>
+            <w:pPr>
+              <w:rPr>
+                <w:rFonts w:ascii="Arial" w:hAnsi="Arial" w:cs="Arial"/>
+              </w:rPr>
+            </w:pPr>
+          </w:p>
+        </w:tc>
+        <w:tc>
+          <w:tcPr>
+            <w:tcW w:w="2221" w:type="dxa"/>
+          </w:tcPr>
+          <w:p>
+            <w:pPr>
+              <w:rPr>
+                <w:rFonts w:ascii="Arial" w:hAnsi="Arial" w:cs="Arial"/>
+              </w:rPr>
+            </w:pPr>
+          </w:p>
+        </w:tc>
+        <w:tc>
+          <w:tcPr>
+            <w:tcW w:w="2253" w:type="dxa"/>
+          </w:tcPr>
+          <w:p>
+            <w:pPr>
+              <w:rPr>
+                <w:rFonts w:ascii="Arial" w:hAnsi="Arial" w:cs="Arial"/>
+                <w:color w:val="FF0000"/>
+              </w:rPr>
+            </w:pPr>
+          </w:p>
+        </w:tc>
+      </w:tr>
+      <w:tr>
+        <w:tc>
+          <w:tcPr>
+            <w:tcW w:w="1418" w:type="dxa"/>
+          </w:tcPr>
+          <w:p>
+            <w:pPr>
+              <w:rPr>
+                <w:rFonts w:ascii="Arial" w:hAnsi="Arial" w:cs="Arial"/>
+              </w:rPr>
+            </w:pPr>
+          </w:p>
+        </w:tc>
+        <w:tc>
+          <w:tcPr>
+            <w:tcW w:w="3118" w:type="dxa"/>
+          </w:tcPr>
+          <w:p>
+            <w:pPr>
+              <w:rPr>
+                <w:rFonts w:ascii="Arial" w:hAnsi="Arial" w:cs="Arial"/>
+              </w:rPr>
+            </w:pPr>
+          </w:p>
+        </w:tc>
+        <w:tc>
+          <w:tcPr>
+            <w:tcW w:w="2221" w:type="dxa"/>
+          </w:tcPr>
+          <w:p>
+            <w:pPr>
+              <w:rPr>
+                <w:rFonts w:ascii="Arial" w:hAnsi="Arial" w:cs="Arial"/>
+              </w:rPr>
+            </w:pPr>
+          </w:p>
+        </w:tc>
+        <w:tc>
+          <w:tcPr>
+            <w:tcW w:w="2253" w:type="dxa"/>
+          </w:tcPr>
+          <w:p>
+            <w:pPr>
+              <w:rPr>
+                <w:rFonts w:ascii="Arial" w:hAnsi="Arial" w:cs="Arial"/>
+              </w:rPr>
+            </w:pPr>
+          </w:p>
+        </w:tc>
+      </w:tr>
+    </w:tbl>
+    <w:p>
+      <w:pPr>
+        <w:rPr>
+          <w:rFonts w:ascii="Arial" w:hAnsi="Arial" w:cs="Arial"/>
+        </w:rPr>
+      </w:pPr>
+    </w:p>
+    <w:p>
+      <w:pPr>
+        <w:rPr>
+          <w:rFonts w:ascii="Arial" w:hAnsi="Arial" w:cs="Arial"/>
+        </w:rPr>
+      </w:pPr>
+    </w:p>
+    <w:p>
+      <w:pPr>
+        <w:rPr>
+          <w:rFonts w:ascii="Arial" w:hAnsi="Arial" w:cs="Arial"/>
+        </w:rPr>
+      </w:pPr>
+      <w:r>
+        <w:rPr>
+          <w:rFonts w:ascii="Arial" w:hAnsi="Arial" w:cs="Arial"/>
+        </w:rPr>
+        <w:t>Before {{</w:t>
+      </w:r>
+      <w:proofErr w:type="spellStart"/>
+      <w:r>
+        <w:rPr>
+          <w:rFonts w:ascii="Arial" w:hAnsi="Arial" w:cs="Arial"/>
+        </w:rPr>
+        <w:t>judgeName</w:t>
+      </w:r>
+      <w:proofErr w:type="spellEnd"/>
+      <w:r>
+        <w:rPr>
+          <w:rFonts w:ascii="Arial" w:hAnsi="Arial" w:cs="Arial"/>
+        </w:rPr>
+        <w:t>}} on {{</w:t>
+      </w:r>
+      <w:proofErr w:type="spellStart"/>
+      <w:r>
+        <w:rPr>
+          <w:rFonts w:ascii="Arial" w:hAnsi="Arial" w:cs="Arial"/>
+        </w:rPr>
+        <w:t>orderDate</w:t>
+      </w:r>
+      <w:proofErr w:type="spellEnd"/>
+      <w:r>
+        <w:rPr>
+          <w:rFonts w:ascii="Arial" w:hAnsi="Arial" w:cs="Arial"/>
+        </w:rPr>
+        <w:t>}} at a hearing.</w:t>
+      </w:r>
+    </w:p>
+    <w:p>
+      <w:pPr>
+        <w:rPr>
+          <w:rFonts w:ascii="Arial" w:hAnsi="Arial" w:cs="Arial"/>
+        </w:rPr>
+      </w:pPr>
+    </w:p>
+    <w:p>
+      <w:pPr>
+        <w:rPr>
+          <w:rFonts w:ascii="Arial" w:hAnsi="Arial" w:cs="Arial"/>
+        </w:rPr>
+      </w:pPr>
+      <w:r>
+        <w:rPr>
+          <w:rFonts w:ascii="Arial" w:hAnsi="Arial" w:cs="Arial"/>
+        </w:rPr>
+        <w:t>The parties:</w:t>
+      </w:r>
+    </w:p>
+    <w:p>
+      <w:pPr>
+        <w:rPr>
+          <w:rFonts w:ascii="Arial" w:hAnsi="Arial" w:cs="Arial"/>
+        </w:rPr>
+      </w:pPr>
+      <w:r>
+        <w:rPr>
+          <w:rFonts w:ascii="Arial" w:hAnsi="Arial" w:cs="Arial"/>
+        </w:rPr>
+        <w:tab/>
+        <w:t xml:space="preserve">The applicant </w:t>
+      </w:r>
+      <w:proofErr w:type="gramStart"/>
+      <w:r>
+        <w:rPr>
+          <w:rFonts w:ascii="Arial" w:hAnsi="Arial" w:cs="Arial"/>
+        </w:rPr>
+        <w:t>is</w:t>
+      </w:r>
+      <w:r>
+        <w:rPr>
+          <w:rFonts w:ascii="Arial" w:hAnsi="Arial" w:cs="Arial"/>
+        </w:rPr>
+        <w:t xml:space="preserve">  </w:t>
+      </w:r>
+      <w:r>
+        <w:rPr>
+          <w:rFonts w:ascii="Arial" w:hAnsi="Arial" w:cs="Arial"/>
+        </w:rPr>
+        <w:t>{</w:t>
+      </w:r>
+      <w:proofErr w:type="gramEnd"/>
+      <w:r>
+        <w:rPr>
+          <w:rFonts w:ascii="Arial" w:hAnsi="Arial" w:cs="Arial"/>
+        </w:rPr>
+        <w:t>{</w:t>
+      </w:r>
+      <w:proofErr w:type="spellStart"/>
+      <w:r>
+        <w:rPr>
+          <w:rFonts w:ascii="Arial" w:hAnsi="Arial" w:cs="Arial"/>
+        </w:rPr>
+        <w:t>applicantName</w:t>
+      </w:r>
+      <w:proofErr w:type="spellEnd"/>
+      <w:r>
+        <w:rPr>
+          <w:rFonts w:ascii="Arial" w:hAnsi="Arial" w:cs="Arial"/>
+        </w:rPr>
+        <w:t>}}</w:t>
+      </w:r>
+      <w:r>
+        <w:rPr>
+          <w:rFonts w:ascii="Arial" w:hAnsi="Arial" w:cs="Arial"/>
+        </w:rPr>
+        <w:t xml:space="preserve"> </w:t>
+      </w:r>
+      <w:r>
+        <w:rPr>
+          <w:rFonts w:ascii="Arial" w:hAnsi="Arial" w:cs="Arial"/>
+        </w:rPr>
+        <w:t>{{</w:t>
+      </w:r>
+      <w:proofErr w:type="spellStart"/>
+      <w:r>
+        <w:rPr>
+          <w:rFonts w:ascii="Arial" w:hAnsi="Arial" w:cs="Arial"/>
+        </w:rPr>
+        <w:t>applicantRepresentativeClause</w:t>
+      </w:r>
+      <w:proofErr w:type="spellEnd"/>
+      <w:r>
+        <w:rPr>
+          <w:rFonts w:ascii="Arial" w:hAnsi="Arial" w:cs="Arial"/>
+        </w:rPr>
+        <w:t>}}</w:t>
+      </w:r>
+    </w:p>
+    <w:p>
+      <w:pPr>
+        <w:rPr>
+          <w:rFonts w:ascii="Arial" w:hAnsi="Arial" w:cs="Arial"/>
+        </w:rPr>
+      </w:pPr>
+    </w:p>
+    <w:tbl>
+      <w:tblPr>
+        <w:tblStyle w:val="TableGrid"/>
+        <w:tblW w:w="0" w:type="auto"/>
+        <w:tblBorders>
+          <w:top w:val="none" w:sz="0" w:space="0" w:color="auto"/>
+          <w:left w:val="none" w:sz="0" w:space="0" w:color="auto"/>
+          <w:bottom w:val="none" w:sz="0" w:space="0" w:color="auto"/>
+          <w:right w:val="none" w:sz="0" w:space="0" w:color="auto"/>
+          <w:insideH w:val="none" w:sz="0" w:space="0" w:color="auto"/>
+          <w:insideV w:val="none" w:sz="0" w:space="0" w:color="auto"/>
+        </w:tblBorders>
+        <w:tblLook w:val="04A0" w:firstRow="1" w:lastRow="0" w:firstColumn="1" w:lastColumn="0" w:noHBand="0" w:noVBand="1"/>
+      </w:tblPr>
+      <w:tblGrid>
+        <w:gridCol w:w="9026"/>
+      </w:tblGrid>
+      <w:tr>
+        <w:tc>
+          <w:tcPr>
+            <w:tcW w:w="9026" w:type="dxa"/>
+          </w:tcPr>
+          <w:p>
+            <w:pPr>
+              <w:rPr>
+                <w:rFonts w:ascii="Arial" w:hAnsi="Arial" w:cs="Arial"/>
+              </w:rPr>
+            </w:pPr>
+            <w:r>
+              <w:rPr>
+                <w:rFonts w:ascii="Arial" w:hAnsi="Arial" w:cs="Arial"/>
+              </w:rPr>
+              <w:t>{{respondents</w:t>
+            </w:r>
+            <w:proofErr w:type="gramStart"/>
+            <w:r>
+              <w:rPr>
+                <w:rFonts w:ascii="Arial" w:hAnsi="Arial" w:cs="Arial"/>
+              </w:rPr>
+              <w:t>}}The</w:t>
+            </w:r>
+            <w:proofErr w:type="gramEnd"/>
+            <w:r>
+              <w:rPr>
+                <w:rFonts w:ascii="Arial" w:hAnsi="Arial" w:cs="Arial"/>
+              </w:rPr>
+              <w:t xml:space="preserve"> [ordinal] respondent is [name], the [relationship]</w:t>
+            </w:r>
+            <w:r>
+              <w:rPr>
+                <w:rFonts w:ascii="Arial" w:hAnsi="Arial" w:cs="Arial"/>
+              </w:rPr>
+              <w:t xml:space="preserve"> </w:t>
+            </w:r>
+            <w:r>
+              <w:rPr>
+                <w:rFonts w:ascii="Arial" w:hAnsi="Arial" w:cs="Arial"/>
+              </w:rPr>
+              <w:t>[</w:t>
+            </w:r>
+            <w:proofErr w:type="spellStart"/>
+            <w:r>
+              <w:rPr>
+                <w:rFonts w:ascii="Arial" w:hAnsi="Arial" w:cs="Arial"/>
+              </w:rPr>
+              <w:t>representativeClause</w:t>
+            </w:r>
+            <w:proofErr w:type="spellEnd"/>
+            <w:r>
+              <w:rPr>
+                <w:rFonts w:ascii="Arial" w:hAnsi="Arial" w:cs="Arial"/>
+              </w:rPr>
+              <w:t>]</w:t>
+            </w:r>
+          </w:p>
+        </w:tc>
+      </w:tr>
+    </w:tbl>
+    <w:p>
+      <w:pPr>
+        <w:rPr>
+          <w:rFonts w:ascii="Arial" w:hAnsi="Arial" w:cs="Arial"/>
+        </w:rPr>
+      </w:pPr>
+    </w:p>
+    <w:p>
+      <w:pPr>
+        <w:rPr>
+          <w:rFonts w:ascii="Arial" w:hAnsi="Arial" w:cs="Arial"/>
+        </w:rPr>
+      </w:pPr>
+      <w:r>
+        <w:rPr>
+          <w:rFonts w:ascii="Arial" w:hAnsi="Arial" w:cs="Arial"/>
+        </w:rPr>
+        <w:t>{{</w:t>
+      </w:r>
+      <w:proofErr w:type="spellStart"/>
+      <w:r>
+        <w:rPr>
+          <w:rFonts w:ascii="Arial" w:hAnsi="Arial" w:cs="Arial"/>
+        </w:rPr>
+        <w:t>appointedGuardianClause</w:t>
+      </w:r>
+      <w:proofErr w:type="spellEnd"/>
+      <w:r>
+        <w:rPr>
+          <w:rFonts w:ascii="Arial" w:hAnsi="Arial" w:cs="Arial"/>
+        </w:rPr>
+        <w:t>}}</w:t>
+      </w:r>
+    </w:p>
+    <w:p>
+      <w:pPr>
+        <w:rPr>
+          <w:rFonts w:ascii="Arial" w:hAnsi="Arial" w:cs="Arial"/>
+        </w:rPr>
+      </w:pPr>
+    </w:p>
+    <w:p>
+      <w:pPr>
+        <w:rPr>
+          <w:rFonts w:ascii="Arial" w:hAnsi="Arial" w:cs="Arial"/>
+        </w:rPr>
+      </w:pPr>
+      <w:r>
+        <w:rPr>
+          <w:rFonts w:ascii="Arial" w:hAnsi="Arial" w:cs="Arial"/>
+        </w:rPr>
+        <w:t>{{</w:t>
+      </w:r>
+      <w:proofErr w:type="spellStart"/>
+      <w:r>
+        <w:rPr>
+          <w:rFonts w:ascii="Arial" w:hAnsi="Arial" w:cs="Arial"/>
+        </w:rPr>
+        <w:t>futureHearingClause</w:t>
+      </w:r>
+      <w:proofErr w:type="spellEnd"/>
+      <w:r>
+        <w:rPr>
+          <w:rFonts w:ascii="Arial" w:hAnsi="Arial" w:cs="Arial"/>
+        </w:rPr>
+        <w:t>}}</w:t>
+      </w:r>
+    </w:p>
+    <w:p>
+      <w:pPr>
+        <w:rPr>
+          <w:rFonts w:ascii="Arial" w:hAnsi="Arial" w:cs="Arial"/>
+        </w:rPr>
+      </w:pPr>
+    </w:p>
+    <w:sectPr>
+      <w:pgSz w:w="11906" w:h="16838"/>
+      <w:pgMar w:top="1440" w:right="1440" w:bottom="1440" w:left="1440" w:header="708" w:footer="708" w:gutter="0"/>
+      <w:cols w:space="708"/>
+      <w:docGrid w:linePitch="360"/>
+    </w:sectPr>
+  </w:body>
+</w:document>
+</file>
+
+<file path=word/document_new.xml><?xml version="1.0" encoding="utf-8"?>
 <w:document xmlns:wpc="http://schemas.microsoft.com/office/word/2010/wordprocessingCanvas" xmlns:cx="http://schemas.microsoft.com/office/drawing/2014/chartex" xmlns:cx1="http://schemas.microsoft.com/office/drawing/2015/9/8/chartex" xmlns:cx2="http://schemas.microsoft.com/office/drawing/2015/10/21/chartex" xmlns:cx3="http://schemas.microsoft.com/office/drawing/2016/5/9/chartex" xmlns:cx4="http://schemas.microsoft.com/office/drawing/2016/5/10/chartex" xmlns:cx5="http://schemas.microsoft.com/office/drawing/2016/5/11/chartex" xmlns:cx6="http://schemas.microsoft.com/office/drawing/2016/5/12/chartex" xmlns:cx7="http://schemas.microsoft.com/office/drawing/2016/5/13/chartex" xmlns:cx8="http://schemas.microsoft.com/office/drawing/2016/5/14/chartex" xmlns:mc="http://schemas.openxmlformats.org/markup-compatibility/2006" xmlns:aink="http://schemas.microsoft.com/office/drawing/2016/ink" xmlns:am3d="http://schemas.microsoft.com/office/drawing/2017/model3d" xmlns:o="urn:schemas-microsoft-com:office:office" xmlns:oel="http://schemas.microsoft.com/office/2019/extlst" xmlns:r="http://schemas.openxmlformats.org/officeDocument/2006/relationships" xmlns:m="http://schemas.openxmlformats.org/officeDocument/2006/math" xmlns:v="urn:schemas-microsoft-com:vml" xmlns:wp14="http://schemas.microsoft.com/office/word/2010/wordprocessingDrawing" xmlns:wp="http://schemas.openxmlformats.org/drawingml/2006/wordprocessingDrawing" xmlns:w10="urn:schemas-microsoft-com:office:word" xmlns:w="http://schemas.openxmlformats.org/wordprocessingml/2006/main" xmlns:w14="http://schemas.microsoft.com/office/word/2010/wordml" xmlns:w15="http://schemas.microsoft.com/office/word/2012/wordml" xmlns:w16cex="http://schemas.microsoft.com/office/word/2018/wordml/cex" xmlns:w16cid="http://schemas.microsoft.com/office/word/2016/wordml/cid" xmlns:w16="http://schemas.microsoft.com/office/word/2018/wordml" xmlns:w16sdtdh="http://schemas.microsoft.com/office/word/2020/wordml/sdtdatahash" xmlns:w16se="http://schemas.microsoft.com/office/word/2015/wordml/symex" xmlns:wpg="http://schemas.microsoft.com/office/word/2010/wordprocessingGroup" xmlns:wpi="http://schemas.microsoft.com/office/word/2010/wordprocessingInk" xmlns:wne="http://schemas.microsoft.com/office/word/2006/wordml" xmlns:wps="http://schemas.microsoft.com/office/word/2010/wordprocessingShape" mc:Ignorable="w14 w15 w16se w16cid w16 w16cex w16sdtdh wp14">
   <w:body>
     <w:tbl>

</xml_diff>

<commit_message>
FPVTL-2249 adding date order ends for fl401, took out a stray comma on header when no relationship set, populating children for fl401 on header, fetching judge title and caching for 30min then auto selecting when judge logged in
</commit_message>
<xml_diff>
--- a/src/main/resources/templates/CustomOrderHeader.docx
+++ b/src/main/resources/templates/CustomOrderHeader.docx
@@ -18,8 +18,8 @@
       </w:tblPr>
       <w:tblGrid>
         <w:gridCol w:w="1563"/>
-        <w:gridCol w:w="3824"/>
-        <w:gridCol w:w="3639"/>
+        <w:gridCol w:w="3476"/>
+        <w:gridCol w:w="3987"/>
       </w:tblGrid>
       <w:tr>
         <w:trPr>
@@ -41,7 +41,7 @@
                 <w:noProof/>
               </w:rPr>
               <w:drawing>
-                <wp:inline distT="0" distB="0" distL="0" distR="0" wp14:anchorId="19327A42" wp14:editId="3562D081">
+                <wp:inline distT="0" distB="0" distL="0" distR="0" wp14:anchorId="29ED4ACA" wp14:editId="0F5AE6A0">
                   <wp:extent cx="855573" cy="712381"/>
                   <wp:effectExtent l="0" t="0" r="0" b="0"/>
                   <wp:docPr id="2" name="Picture 2" descr="A black and white logo&#10;&#10;Description automatically generated"/>
@@ -204,7 +204,7 @@
               <w:t>}}</w:t>
             </w:r>
           </w:p>
-          <w:p w14:paraId="FM000001" w14:textId="FM000001">
+          <w:p>
             <w:pPr>
               <w:rPr>
                 <w:rFonts w:ascii="Arial" w:hAnsi="Arial" w:cs="Arial"/>
@@ -219,7 +219,7 @@
               <w:t>{{familymanLabel}}</w:t>
             </w:r>
           </w:p>
-          <w:p w14:paraId="FM000002" w14:textId="FM000002">
+          <w:p>
             <w:pPr>
               <w:rPr>
                 <w:rFonts w:ascii="Arial" w:hAnsi="Arial" w:cs="Arial"/>
@@ -796,33 +796,19 @@
           <w:rFonts w:ascii="Arial" w:hAnsi="Arial" w:cs="Arial"/>
         </w:rPr>
         <w:tab/>
-        <w:t xml:space="preserve">The applicant </w:t>
-      </w:r>
-      <w:proofErr w:type="gramStart"/>
-      <w:r>
-        <w:rPr>
-          <w:rFonts w:ascii="Arial" w:hAnsi="Arial" w:cs="Arial"/>
-        </w:rPr>
-        <w:t>is</w:t>
+        <w:t>The applicant is</w:t>
       </w:r>
       <w:r>
         <w:rPr>
           <w:rFonts w:ascii="Arial" w:hAnsi="Arial" w:cs="Arial"/>
         </w:rPr>
-        <w:t xml:space="preserve">  </w:t>
+        <w:t xml:space="preserve"> </w:t>
       </w:r>
       <w:r>
         <w:rPr>
           <w:rFonts w:ascii="Arial" w:hAnsi="Arial" w:cs="Arial"/>
         </w:rPr>
-        <w:t>{</w:t>
-      </w:r>
-      <w:proofErr w:type="gramEnd"/>
-      <w:r>
-        <w:rPr>
-          <w:rFonts w:ascii="Arial" w:hAnsi="Arial" w:cs="Arial"/>
-        </w:rPr>
-        <w:t>{</w:t>
+        <w:t>{{</w:t>
       </w:r>
       <w:proofErr w:type="spellStart"/>
       <w:r>
@@ -904,33 +890,27 @@
               <w:rPr>
                 <w:rFonts w:ascii="Arial" w:hAnsi="Arial" w:cs="Arial"/>
               </w:rPr>
-              <w:t>{{respondents</w:t>
-            </w:r>
-            <w:proofErr w:type="gramStart"/>
-            <w:r>
-              <w:rPr>
-                <w:rFonts w:ascii="Arial" w:hAnsi="Arial" w:cs="Arial"/>
-              </w:rPr>
-              <w:t>}}The</w:t>
-            </w:r>
-            <w:proofErr w:type="gramEnd"/>
-            <w:r>
-              <w:rPr>
-                <w:rFonts w:ascii="Arial" w:hAnsi="Arial" w:cs="Arial"/>
-              </w:rPr>
-              <w:t xml:space="preserve"> [ordinal] respondent is [name], the [relationship]</w:t>
-            </w:r>
-            <w:r>
-              <w:rPr>
-                <w:rFonts w:ascii="Arial" w:hAnsi="Arial" w:cs="Arial"/>
-              </w:rPr>
-              <w:t xml:space="preserve"> </w:t>
-            </w:r>
-            <w:r>
-              <w:rPr>
-                <w:rFonts w:ascii="Arial" w:hAnsi="Arial" w:cs="Arial"/>
-              </w:rPr>
-              <w:t>[</w:t>
+              <w:t>{{respondents}}</w:t>
+            </w:r>
+            <w:r>
+              <w:rPr>
+                <w:rFonts w:ascii="Arial" w:hAnsi="Arial" w:cs="Arial"/>
+              </w:rPr>
+              <w:t xml:space="preserve"> The [ordinal] respondent is [name][</w:t>
+            </w:r>
+            <w:proofErr w:type="spellStart"/>
+            <w:r>
+              <w:rPr>
+                <w:rFonts w:ascii="Arial" w:hAnsi="Arial" w:cs="Arial"/>
+              </w:rPr>
+              <w:t>relationshipClause</w:t>
+            </w:r>
+            <w:proofErr w:type="spellEnd"/>
+            <w:r>
+              <w:rPr>
+                <w:rFonts w:ascii="Arial" w:hAnsi="Arial" w:cs="Arial"/>
+              </w:rPr>
+              <w:t>] [</w:t>
             </w:r>
             <w:proofErr w:type="spellStart"/>
             <w:r>
@@ -990,1039 +970,6 @@
           <w:rFonts w:ascii="Arial" w:hAnsi="Arial" w:cs="Arial"/>
         </w:rPr>
       </w:pPr>
-    </w:p>
-    <w:p>
-      <w:pPr>
-        <w:rPr>
-          <w:rFonts w:ascii="Arial" w:hAnsi="Arial" w:cs="Arial"/>
-        </w:rPr>
-      </w:pPr>
-      <w:r>
-        <w:rPr>
-          <w:rFonts w:ascii="Arial" w:hAnsi="Arial" w:cs="Arial"/>
-        </w:rPr>
-        <w:t>{{</w:t>
-      </w:r>
-      <w:proofErr w:type="spellStart"/>
-      <w:r>
-        <w:rPr>
-          <w:rFonts w:ascii="Arial" w:hAnsi="Arial" w:cs="Arial"/>
-        </w:rPr>
-        <w:t>futureHearingClause</w:t>
-      </w:r>
-      <w:proofErr w:type="spellEnd"/>
-      <w:r>
-        <w:rPr>
-          <w:rFonts w:ascii="Arial" w:hAnsi="Arial" w:cs="Arial"/>
-        </w:rPr>
-        <w:t>}}</w:t>
-      </w:r>
-    </w:p>
-    <w:p>
-      <w:pPr>
-        <w:rPr>
-          <w:rFonts w:ascii="Arial" w:hAnsi="Arial" w:cs="Arial"/>
-        </w:rPr>
-      </w:pPr>
-    </w:p>
-    <w:sectPr>
-      <w:pgSz w:w="11906" w:h="16838"/>
-      <w:pgMar w:top="1440" w:right="1440" w:bottom="1440" w:left="1440" w:header="708" w:footer="708" w:gutter="0"/>
-      <w:cols w:space="708"/>
-      <w:docGrid w:linePitch="360"/>
-    </w:sectPr>
-  </w:body>
-</w:document>
-</file>
-
-<file path=word/document_new.xml><?xml version="1.0" encoding="utf-8"?>
-<w:document xmlns:wpc="http://schemas.microsoft.com/office/word/2010/wordprocessingCanvas" xmlns:cx="http://schemas.microsoft.com/office/drawing/2014/chartex" xmlns:cx1="http://schemas.microsoft.com/office/drawing/2015/9/8/chartex" xmlns:cx2="http://schemas.microsoft.com/office/drawing/2015/10/21/chartex" xmlns:cx3="http://schemas.microsoft.com/office/drawing/2016/5/9/chartex" xmlns:cx4="http://schemas.microsoft.com/office/drawing/2016/5/10/chartex" xmlns:cx5="http://schemas.microsoft.com/office/drawing/2016/5/11/chartex" xmlns:cx6="http://schemas.microsoft.com/office/drawing/2016/5/12/chartex" xmlns:cx7="http://schemas.microsoft.com/office/drawing/2016/5/13/chartex" xmlns:cx8="http://schemas.microsoft.com/office/drawing/2016/5/14/chartex" xmlns:mc="http://schemas.openxmlformats.org/markup-compatibility/2006" xmlns:aink="http://schemas.microsoft.com/office/drawing/2016/ink" xmlns:am3d="http://schemas.microsoft.com/office/drawing/2017/model3d" xmlns:o="urn:schemas-microsoft-com:office:office" xmlns:oel="http://schemas.microsoft.com/office/2019/extlst" xmlns:r="http://schemas.openxmlformats.org/officeDocument/2006/relationships" xmlns:m="http://schemas.openxmlformats.org/officeDocument/2006/math" xmlns:v="urn:schemas-microsoft-com:vml" xmlns:wp14="http://schemas.microsoft.com/office/word/2010/wordprocessingDrawing" xmlns:wp="http://schemas.openxmlformats.org/drawingml/2006/wordprocessingDrawing" xmlns:w10="urn:schemas-microsoft-com:office:word" xmlns:w="http://schemas.openxmlformats.org/wordprocessingml/2006/main" xmlns:w14="http://schemas.microsoft.com/office/word/2010/wordml" xmlns:w15="http://schemas.microsoft.com/office/word/2012/wordml" xmlns:w16cex="http://schemas.microsoft.com/office/word/2018/wordml/cex" xmlns:w16cid="http://schemas.microsoft.com/office/word/2016/wordml/cid" xmlns:w16="http://schemas.microsoft.com/office/word/2018/wordml" xmlns:w16sdtdh="http://schemas.microsoft.com/office/word/2020/wordml/sdtdatahash" xmlns:w16se="http://schemas.microsoft.com/office/word/2015/wordml/symex" xmlns:wpg="http://schemas.microsoft.com/office/word/2010/wordprocessingGroup" xmlns:wpi="http://schemas.microsoft.com/office/word/2010/wordprocessingInk" xmlns:wne="http://schemas.microsoft.com/office/word/2006/wordml" xmlns:wps="http://schemas.microsoft.com/office/word/2010/wordprocessingShape" mc:Ignorable="w14 w15 w16se w16cid w16 w16cex w16sdtdh wp14">
-  <w:body>
-    <w:tbl>
-      <w:tblPr>
-        <w:tblStyle w:val="TableGrid"/>
-        <w:tblW w:w="0" w:type="auto"/>
-        <w:tblBorders>
-          <w:top w:val="none" w:sz="0" w:space="0" w:color="auto"/>
-          <w:left w:val="none" w:sz="0" w:space="0" w:color="auto"/>
-          <w:bottom w:val="none" w:sz="0" w:space="0" w:color="auto"/>
-          <w:right w:val="none" w:sz="0" w:space="0" w:color="auto"/>
-          <w:insideH w:val="none" w:sz="0" w:space="0" w:color="auto"/>
-          <w:insideV w:val="none" w:sz="0" w:space="0" w:color="auto"/>
-        </w:tblBorders>
-        <w:tblLook w:val="04A0" w:firstRow="1" w:lastRow="0" w:firstColumn="1" w:lastColumn="0" w:noHBand="0" w:noVBand="1"/>
-      </w:tblPr>
-      <w:tblGrid>
-        <w:gridCol w:w="1563"/>
-        <w:gridCol w:w="3824"/>
-        <w:gridCol w:w="3639"/>
-      </w:tblGrid>
-      <w:tr>
-        <w:trPr>
-          <w:trHeight w:val="1121"/>
-        </w:trPr>
-        <w:tc>
-          <w:tcPr>
-            <w:tcW w:w="1563" w:type="dxa"/>
-          </w:tcPr>
-          <w:p>
-            <w:pPr>
-              <w:rPr>
-                <w:rFonts w:ascii="Arial" w:hAnsi="Arial" w:cs="Arial"/>
-              </w:rPr>
-            </w:pPr>
-            <w:r>
-              <w:rPr>
-                <w:rFonts w:ascii="Arial" w:hAnsi="Arial" w:cs="Arial"/>
-                <w:noProof/>
-              </w:rPr>
-              <w:drawing>
-                <wp:inline distT="0" distB="0" distL="0" distR="0" wp14:anchorId="19327A42" wp14:editId="3562D081">
-                  <wp:extent cx="855573" cy="712381"/>
-                  <wp:effectExtent l="0" t="0" r="0" b="0"/>
-                  <wp:docPr id="2" name="Picture 2" descr="A black and white logo&#10;&#10;Description automatically generated"/>
-                  <wp:cNvGraphicFramePr>
-                    <a:graphicFrameLocks xmlns:a="http://schemas.openxmlformats.org/drawingml/2006/main" noChangeAspect="1"/>
-                  </wp:cNvGraphicFramePr>
-                  <a:graphic xmlns:a="http://schemas.openxmlformats.org/drawingml/2006/main">
-                    <a:graphicData uri="http://schemas.openxmlformats.org/drawingml/2006/picture">
-                      <pic:pic xmlns:pic="http://schemas.openxmlformats.org/drawingml/2006/picture">
-                        <pic:nvPicPr>
-                          <pic:cNvPr id="2" name="Picture 2" descr="A black and white logo&#10;&#10;Description automatically generated"/>
-                          <pic:cNvPicPr/>
-                        </pic:nvPicPr>
-                        <pic:blipFill>
-                          <a:blip r:embed="rId4" cstate="print">
-                            <a:extLst>
-                              <a:ext uri="{28A0092B-C50C-407E-A947-70E740481C1C}">
-                                <a14:useLocalDpi xmlns:a14="http://schemas.microsoft.com/office/drawing/2010/main" val="0"/>
-                              </a:ext>
-                            </a:extLst>
-                          </a:blip>
-                          <a:stretch>
-                            <a:fillRect/>
-                          </a:stretch>
-                        </pic:blipFill>
-                        <pic:spPr>
-                          <a:xfrm>
-                            <a:off x="0" y="0"/>
-                            <a:ext cx="950185" cy="791158"/>
-                          </a:xfrm>
-                          <a:prstGeom prst="rect">
-                            <a:avLst/>
-                          </a:prstGeom>
-                        </pic:spPr>
-                      </pic:pic>
-                    </a:graphicData>
-                  </a:graphic>
-                </wp:inline>
-              </w:drawing>
-            </w:r>
-          </w:p>
-        </w:tc>
-        <w:tc>
-          <w:tcPr>
-            <w:tcW w:w="3824" w:type="dxa"/>
-          </w:tcPr>
-          <w:p>
-            <w:pPr>
-              <w:rPr>
-                <w:rFonts w:ascii="Arial" w:hAnsi="Arial" w:cs="Arial"/>
-                <w:sz w:val="32"/>
-                <w:szCs w:val="28"/>
-              </w:rPr>
-            </w:pPr>
-            <w:r>
-              <w:rPr>
-                <w:rFonts w:ascii="Arial" w:hAnsi="Arial" w:cs="Arial"/>
-                <w:sz w:val="32"/>
-                <w:szCs w:val="28"/>
-              </w:rPr>
-              <w:t>In the Family Court</w:t>
-            </w:r>
-          </w:p>
-          <w:p>
-            <w:pPr>
-              <w:rPr>
-                <w:rFonts w:ascii="Arial" w:hAnsi="Arial" w:cs="Arial"/>
-                <w:sz w:val="32"/>
-              </w:rPr>
-            </w:pPr>
-            <w:r>
-              <w:rPr>
-                <w:rFonts w:ascii="Arial" w:hAnsi="Arial" w:cs="Arial"/>
-                <w:sz w:val="32"/>
-                <w:szCs w:val="28"/>
-              </w:rPr>
-              <w:t xml:space="preserve">sitting at </w:t>
-            </w:r>
-            <w:r>
-              <w:rPr>
-                <w:rFonts w:ascii="Arial" w:hAnsi="Arial" w:cs="Arial"/>
-                <w:sz w:val="32"/>
-              </w:rPr>
-              <w:t>{{</w:t>
-            </w:r>
-            <w:proofErr w:type="spellStart"/>
-            <w:r>
-              <w:rPr>
-                <w:rFonts w:ascii="Arial" w:hAnsi="Arial" w:cs="Arial"/>
-                <w:sz w:val="32"/>
-              </w:rPr>
-              <w:t>courtName</w:t>
-            </w:r>
-            <w:proofErr w:type="spellEnd"/>
-            <w:r>
-              <w:rPr>
-                <w:rFonts w:ascii="Arial" w:hAnsi="Arial" w:cs="Arial"/>
-                <w:sz w:val="32"/>
-              </w:rPr>
-              <w:t>}}</w:t>
-            </w:r>
-          </w:p>
-          <w:p>
-            <w:pPr>
-              <w:rPr>
-                <w:rFonts w:ascii="Arial" w:hAnsi="Arial" w:cs="Arial"/>
-                <w:sz w:val="32"/>
-                <w:szCs w:val="28"/>
-              </w:rPr>
-            </w:pPr>
-          </w:p>
-        </w:tc>
-        <w:tc>
-          <w:tcPr>
-            <w:tcW w:w="3639" w:type="dxa"/>
-          </w:tcPr>
-          <w:p>
-            <w:pPr>
-              <w:rPr>
-                <w:rFonts w:ascii="Arial" w:hAnsi="Arial" w:cs="Arial"/>
-                <w:sz w:val="32"/>
-              </w:rPr>
-            </w:pPr>
-            <w:r>
-              <w:rPr>
-                <w:rFonts w:ascii="Arial" w:hAnsi="Arial" w:cs="Arial"/>
-                <w:sz w:val="32"/>
-              </w:rPr>
-              <w:t>Case No:</w:t>
-            </w:r>
-          </w:p>
-          <w:p>
-            <w:pPr>
-              <w:rPr>
-                <w:rFonts w:ascii="Arial" w:hAnsi="Arial" w:cs="Arial"/>
-                <w:sz w:val="32"/>
-              </w:rPr>
-            </w:pPr>
-            <w:r>
-              <w:rPr>
-                <w:rFonts w:ascii="Arial" w:hAnsi="Arial" w:cs="Arial"/>
-                <w:sz w:val="32"/>
-              </w:rPr>
-              <w:t>{{</w:t>
-            </w:r>
-            <w:proofErr w:type="spellStart"/>
-            <w:r>
-              <w:rPr>
-                <w:rFonts w:ascii="Arial" w:hAnsi="Arial" w:cs="Arial"/>
-                <w:sz w:val="32"/>
-              </w:rPr>
-              <w:t>caseNumber</w:t>
-            </w:r>
-            <w:proofErr w:type="spellEnd"/>
-            <w:r>
-              <w:rPr>
-                <w:rFonts w:ascii="Arial" w:hAnsi="Arial" w:cs="Arial"/>
-                <w:sz w:val="32"/>
-              </w:rPr>
-              <w:t>}}</w:t>
-            </w:r>
-          </w:p>
-          <w:p>
-            <w:pPr>
-              <w:rPr>
-                <w:rFonts w:ascii="Arial" w:hAnsi="Arial" w:cs="Arial"/>
-                <w:sz w:val="32"/>
-              </w:rPr>
-            </w:pPr>
-          </w:p>
-        </w:tc>
-      </w:tr>
-    </w:tbl>
-    <w:tbl>
-      <w:tblPr>
-        <w:tblW w:w="9010" w:type="dxa"/>
-        <w:tblInd w:w="108" w:type="dxa"/>
-        <w:tblBorders>
-          <w:top w:val="single" w:sz="4" w:space="0" w:color="000000"/>
-          <w:left w:val="nil"/>
-          <w:bottom w:val="single" w:sz="4" w:space="0" w:color="000000"/>
-          <w:right w:val="nil"/>
-          <w:insideH w:val="nil"/>
-          <w:insideV w:val="nil"/>
-        </w:tblBorders>
-        <w:tblLayout w:type="fixed"/>
-        <w:tblLook w:val="0400" w:firstRow="0" w:lastRow="0" w:firstColumn="0" w:lastColumn="0" w:noHBand="0" w:noVBand="1"/>
-      </w:tblPr>
-      <w:tblGrid>
-        <w:gridCol w:w="1418"/>
-        <w:gridCol w:w="3118"/>
-        <w:gridCol w:w="2221"/>
-        <w:gridCol w:w="2253"/>
-      </w:tblGrid>
-      <w:tr>
-        <w:tc>
-          <w:tcPr>
-            <w:tcW w:w="1418" w:type="dxa"/>
-          </w:tcPr>
-          <w:p>
-            <w:pPr>
-              <w:rPr>
-                <w:rFonts w:ascii="Arial" w:hAnsi="Arial" w:cs="Arial"/>
-              </w:rPr>
-            </w:pPr>
-          </w:p>
-        </w:tc>
-        <w:tc>
-          <w:tcPr>
-            <w:tcW w:w="7592" w:type="dxa"/>
-            <w:gridSpan w:val="3"/>
-            <w:tcBorders>
-              <w:top w:val="single" w:sz="4" w:space="0" w:color="000000"/>
-              <w:bottom w:val="single" w:sz="4" w:space="0" w:color="000000"/>
-            </w:tcBorders>
-            <w:tcMar>
-              <w:top w:w="57" w:type="dxa"/>
-              <w:bottom w:w="57" w:type="dxa"/>
-            </w:tcMar>
-            <w:vAlign w:val="center"/>
-          </w:tcPr>
-          <w:p>
-            <w:pPr>
-              <w:rPr>
-                <w:rFonts w:ascii="Arial" w:hAnsi="Arial" w:cs="Arial"/>
-              </w:rPr>
-            </w:pPr>
-            <w:r>
-              <w:rPr>
-                <w:rFonts w:ascii="Arial" w:hAnsi="Arial" w:cs="Arial"/>
-              </w:rPr>
-              <w:t>Order</w:t>
-            </w:r>
-          </w:p>
-          <w:p>
-            <w:pPr>
-              <w:rPr>
-                <w:rFonts w:ascii="Arial" w:hAnsi="Arial" w:cs="Arial"/>
-              </w:rPr>
-            </w:pPr>
-            <w:r>
-              <w:rPr>
-                <w:rFonts w:ascii="Arial" w:hAnsi="Arial" w:cs="Arial"/>
-              </w:rPr>
-              <w:t>{{</w:t>
-            </w:r>
-            <w:proofErr w:type="spellStart"/>
-            <w:r>
-              <w:rPr>
-                <w:rFonts w:ascii="Arial" w:hAnsi="Arial" w:cs="Arial"/>
-              </w:rPr>
-              <w:t>orderName</w:t>
-            </w:r>
-            <w:proofErr w:type="spellEnd"/>
-            <w:r>
-              <w:rPr>
-                <w:rFonts w:ascii="Arial" w:hAnsi="Arial" w:cs="Arial"/>
-              </w:rPr>
-              <w:t>}}</w:t>
-            </w:r>
-          </w:p>
-        </w:tc>
-      </w:tr>
-      <w:tr>
-        <w:tc>
-          <w:tcPr>
-            <w:tcW w:w="1418" w:type="dxa"/>
-          </w:tcPr>
-          <w:p>
-            <w:pPr>
-              <w:rPr>
-                <w:rFonts w:ascii="Arial" w:hAnsi="Arial" w:cs="Arial"/>
-              </w:rPr>
-            </w:pPr>
-          </w:p>
-        </w:tc>
-        <w:tc>
-          <w:tcPr>
-            <w:tcW w:w="3118" w:type="dxa"/>
-            <w:tcBorders>
-              <w:top w:val="single" w:sz="4" w:space="0" w:color="000000"/>
-            </w:tcBorders>
-          </w:tcPr>
-          <w:p>
-            <w:pPr>
-              <w:rPr>
-                <w:rFonts w:ascii="Arial" w:hAnsi="Arial" w:cs="Arial"/>
-              </w:rPr>
-            </w:pPr>
-          </w:p>
-        </w:tc>
-        <w:tc>
-          <w:tcPr>
-            <w:tcW w:w="2221" w:type="dxa"/>
-            <w:tcBorders>
-              <w:top w:val="single" w:sz="4" w:space="0" w:color="000000"/>
-            </w:tcBorders>
-          </w:tcPr>
-          <w:p>
-            <w:pPr>
-              <w:rPr>
-                <w:rFonts w:ascii="Arial" w:hAnsi="Arial" w:cs="Arial"/>
-              </w:rPr>
-            </w:pPr>
-          </w:p>
-        </w:tc>
-        <w:tc>
-          <w:tcPr>
-            <w:tcW w:w="2253" w:type="dxa"/>
-            <w:tcBorders>
-              <w:top w:val="single" w:sz="4" w:space="0" w:color="000000"/>
-            </w:tcBorders>
-          </w:tcPr>
-          <w:p>
-            <w:pPr>
-              <w:rPr>
-                <w:rFonts w:ascii="Arial" w:hAnsi="Arial" w:cs="Arial"/>
-              </w:rPr>
-            </w:pPr>
-          </w:p>
-        </w:tc>
-      </w:tr>
-      <w:tr>
-        <w:tc>
-          <w:tcPr>
-            <w:tcW w:w="1418" w:type="dxa"/>
-          </w:tcPr>
-          <w:p>
-            <w:pPr>
-              <w:rPr>
-                <w:rFonts w:ascii="Arial" w:hAnsi="Arial" w:cs="Arial"/>
-              </w:rPr>
-            </w:pPr>
-          </w:p>
-        </w:tc>
-        <w:tc>
-          <w:tcPr>
-            <w:tcW w:w="3118" w:type="dxa"/>
-          </w:tcPr>
-          <w:p>
-            <w:pPr>
-              <w:rPr>
-                <w:rFonts w:ascii="Arial" w:hAnsi="Arial" w:cs="Arial"/>
-              </w:rPr>
-            </w:pPr>
-            <w:r>
-              <w:rPr>
-                <w:rFonts w:ascii="Arial" w:hAnsi="Arial" w:cs="Arial"/>
-              </w:rPr>
-              <w:t>The full name(s) of the child(ren)</w:t>
-            </w:r>
-          </w:p>
-        </w:tc>
-        <w:tc>
-          <w:tcPr>
-            <w:tcW w:w="2221" w:type="dxa"/>
-          </w:tcPr>
-          <w:p>
-            <w:pPr>
-              <w:rPr>
-                <w:rFonts w:ascii="Arial" w:hAnsi="Arial" w:cs="Arial"/>
-              </w:rPr>
-            </w:pPr>
-            <w:r>
-              <w:rPr>
-                <w:rFonts w:ascii="Arial" w:hAnsi="Arial" w:cs="Arial"/>
-              </w:rPr>
-              <w:t>Sex</w:t>
-            </w:r>
-          </w:p>
-        </w:tc>
-        <w:tc>
-          <w:tcPr>
-            <w:tcW w:w="2253" w:type="dxa"/>
-          </w:tcPr>
-          <w:p>
-            <w:pPr>
-              <w:rPr>
-                <w:rFonts w:ascii="Arial" w:hAnsi="Arial" w:cs="Arial"/>
-              </w:rPr>
-            </w:pPr>
-            <w:r>
-              <w:rPr>
-                <w:rFonts w:ascii="Arial" w:hAnsi="Arial" w:cs="Arial"/>
-              </w:rPr>
-              <w:t>Date(s) of Birth</w:t>
-            </w:r>
-          </w:p>
-        </w:tc>
-      </w:tr>
-      <w:tr>
-        <w:trPr>
-          <w:trHeight w:val="403"/>
-        </w:trPr>
-        <w:tc>
-          <w:tcPr>
-            <w:tcW w:w="1418" w:type="dxa"/>
-          </w:tcPr>
-          <w:p>
-            <w:pPr>
-              <w:rPr>
-                <w:rFonts w:ascii="Arial" w:hAnsi="Arial" w:cs="Arial"/>
-              </w:rPr>
-            </w:pPr>
-          </w:p>
-        </w:tc>
-        <w:tc>
-          <w:tcPr>
-            <w:tcW w:w="3118" w:type="dxa"/>
-          </w:tcPr>
-          <w:p>
-            <w:pPr>
-              <w:rPr>
-                <w:rFonts w:ascii="Arial" w:hAnsi="Arial" w:cs="Arial"/>
-              </w:rPr>
-            </w:pPr>
-          </w:p>
-        </w:tc>
-        <w:tc>
-          <w:tcPr>
-            <w:tcW w:w="2221" w:type="dxa"/>
-          </w:tcPr>
-          <w:p>
-            <w:pPr>
-              <w:rPr>
-                <w:rFonts w:ascii="Arial" w:hAnsi="Arial" w:cs="Arial"/>
-              </w:rPr>
-            </w:pPr>
-          </w:p>
-        </w:tc>
-        <w:tc>
-          <w:tcPr>
-            <w:tcW w:w="2253" w:type="dxa"/>
-          </w:tcPr>
-          <w:p>
-            <w:pPr>
-              <w:rPr>
-                <w:rFonts w:ascii="Arial" w:hAnsi="Arial" w:cs="Arial"/>
-              </w:rPr>
-            </w:pPr>
-          </w:p>
-        </w:tc>
-      </w:tr>
-      <w:tr>
-        <w:trPr>
-          <w:trHeight w:val="403"/>
-        </w:trPr>
-        <w:tc>
-          <w:tcPr>
-            <w:tcW w:w="1418" w:type="dxa"/>
-          </w:tcPr>
-          <w:p>
-            <w:pPr>
-              <w:rPr>
-                <w:rFonts w:ascii="Arial" w:hAnsi="Arial" w:cs="Arial"/>
-              </w:rPr>
-            </w:pPr>
-          </w:p>
-        </w:tc>
-        <w:tc>
-          <w:tcPr>
-            <w:tcW w:w="3118" w:type="dxa"/>
-          </w:tcPr>
-          <w:p>
-            <w:pPr>
-              <w:rPr>
-                <w:rFonts w:ascii="Arial" w:hAnsi="Arial" w:cs="Arial"/>
-              </w:rPr>
-            </w:pPr>
-            <w:r>
-              <w:rPr>
-                <w:rFonts w:ascii="Arial" w:hAnsi="Arial" w:cs="Arial"/>
-              </w:rPr>
-              <w:t>{{children</w:t>
-            </w:r>
-            <w:proofErr w:type="gramStart"/>
-            <w:r>
-              <w:rPr>
-                <w:rFonts w:ascii="Arial" w:hAnsi="Arial" w:cs="Arial"/>
-              </w:rPr>
-              <w:t>}}[</w:t>
-            </w:r>
-            <w:proofErr w:type="spellStart"/>
-            <w:proofErr w:type="gramEnd"/>
-            <w:r>
-              <w:rPr>
-                <w:rFonts w:ascii="Arial" w:hAnsi="Arial" w:cs="Arial"/>
-              </w:rPr>
-              <w:t>fullName</w:t>
-            </w:r>
-            <w:proofErr w:type="spellEnd"/>
-            <w:r>
-              <w:rPr>
-                <w:rFonts w:ascii="Arial" w:hAnsi="Arial" w:cs="Arial"/>
-              </w:rPr>
-              <w:t>]</w:t>
-            </w:r>
-          </w:p>
-        </w:tc>
-        <w:tc>
-          <w:tcPr>
-            <w:tcW w:w="2221" w:type="dxa"/>
-          </w:tcPr>
-          <w:p>
-            <w:pPr>
-              <w:rPr>
-                <w:rFonts w:ascii="Arial" w:hAnsi="Arial" w:cs="Arial"/>
-              </w:rPr>
-            </w:pPr>
-            <w:r>
-              <w:rPr>
-                <w:rFonts w:ascii="Arial" w:hAnsi="Arial" w:cs="Arial"/>
-              </w:rPr>
-              <w:t>[gender]</w:t>
-            </w:r>
-          </w:p>
-        </w:tc>
-        <w:tc>
-          <w:tcPr>
-            <w:tcW w:w="2253" w:type="dxa"/>
-          </w:tcPr>
-          <w:p>
-            <w:pPr>
-              <w:rPr>
-                <w:rFonts w:ascii="Arial" w:hAnsi="Arial" w:cs="Arial"/>
-              </w:rPr>
-            </w:pPr>
-            <w:r>
-              <w:rPr>
-                <w:rFonts w:ascii="Arial" w:hAnsi="Arial" w:cs="Arial"/>
-              </w:rPr>
-              <w:t>[dob]</w:t>
-            </w:r>
-          </w:p>
-        </w:tc>
-      </w:tr>
-      <w:tr>
-        <w:tc>
-          <w:tcPr>
-            <w:tcW w:w="1418" w:type="dxa"/>
-          </w:tcPr>
-          <w:p>
-            <w:pPr>
-              <w:rPr>
-                <w:rFonts w:ascii="Arial" w:hAnsi="Arial" w:cs="Arial"/>
-              </w:rPr>
-            </w:pPr>
-          </w:p>
-        </w:tc>
-        <w:tc>
-          <w:tcPr>
-            <w:tcW w:w="3118" w:type="dxa"/>
-          </w:tcPr>
-          <w:p>
-            <w:pPr>
-              <w:rPr>
-                <w:rFonts w:ascii="Arial" w:hAnsi="Arial" w:cs="Arial"/>
-              </w:rPr>
-            </w:pPr>
-          </w:p>
-        </w:tc>
-        <w:tc>
-          <w:tcPr>
-            <w:tcW w:w="2221" w:type="dxa"/>
-          </w:tcPr>
-          <w:p>
-            <w:pPr>
-              <w:rPr>
-                <w:rFonts w:ascii="Arial" w:hAnsi="Arial" w:cs="Arial"/>
-              </w:rPr>
-            </w:pPr>
-          </w:p>
-        </w:tc>
-        <w:tc>
-          <w:tcPr>
-            <w:tcW w:w="2253" w:type="dxa"/>
-          </w:tcPr>
-          <w:p>
-            <w:pPr>
-              <w:rPr>
-                <w:rFonts w:ascii="Arial" w:hAnsi="Arial" w:cs="Arial"/>
-                <w:color w:val="FF0000"/>
-              </w:rPr>
-            </w:pPr>
-          </w:p>
-        </w:tc>
-      </w:tr>
-      <w:tr>
-        <w:tc>
-          <w:tcPr>
-            <w:tcW w:w="1418" w:type="dxa"/>
-          </w:tcPr>
-          <w:p>
-            <w:pPr>
-              <w:rPr>
-                <w:rFonts w:ascii="Arial" w:hAnsi="Arial" w:cs="Arial"/>
-              </w:rPr>
-            </w:pPr>
-          </w:p>
-        </w:tc>
-        <w:tc>
-          <w:tcPr>
-            <w:tcW w:w="3118" w:type="dxa"/>
-          </w:tcPr>
-          <w:p>
-            <w:pPr>
-              <w:rPr>
-                <w:rFonts w:ascii="Arial" w:hAnsi="Arial" w:cs="Arial"/>
-              </w:rPr>
-            </w:pPr>
-          </w:p>
-        </w:tc>
-        <w:tc>
-          <w:tcPr>
-            <w:tcW w:w="2221" w:type="dxa"/>
-          </w:tcPr>
-          <w:p>
-            <w:pPr>
-              <w:rPr>
-                <w:rFonts w:ascii="Arial" w:hAnsi="Arial" w:cs="Arial"/>
-              </w:rPr>
-            </w:pPr>
-          </w:p>
-        </w:tc>
-        <w:tc>
-          <w:tcPr>
-            <w:tcW w:w="2253" w:type="dxa"/>
-          </w:tcPr>
-          <w:p>
-            <w:pPr>
-              <w:rPr>
-                <w:rFonts w:ascii="Arial" w:hAnsi="Arial" w:cs="Arial"/>
-              </w:rPr>
-            </w:pPr>
-          </w:p>
-        </w:tc>
-      </w:tr>
-    </w:tbl>
-    <w:p>
-      <w:pPr>
-        <w:rPr>
-          <w:rFonts w:ascii="Arial" w:hAnsi="Arial" w:cs="Arial"/>
-        </w:rPr>
-      </w:pPr>
-    </w:p>
-    <w:p>
-      <w:pPr>
-        <w:rPr>
-          <w:rFonts w:ascii="Arial" w:hAnsi="Arial" w:cs="Arial"/>
-        </w:rPr>
-      </w:pPr>
-    </w:p>
-    <w:p>
-      <w:pPr>
-        <w:rPr>
-          <w:rFonts w:ascii="Arial" w:hAnsi="Arial" w:cs="Arial"/>
-        </w:rPr>
-      </w:pPr>
-      <w:r>
-        <w:rPr>
-          <w:rFonts w:ascii="Arial" w:hAnsi="Arial" w:cs="Arial"/>
-        </w:rPr>
-        <w:t>Before {{</w:t>
-      </w:r>
-      <w:proofErr w:type="spellStart"/>
-      <w:r>
-        <w:rPr>
-          <w:rFonts w:ascii="Arial" w:hAnsi="Arial" w:cs="Arial"/>
-        </w:rPr>
-        <w:t>judgeName</w:t>
-      </w:r>
-      <w:proofErr w:type="spellEnd"/>
-      <w:r>
-        <w:rPr>
-          <w:rFonts w:ascii="Arial" w:hAnsi="Arial" w:cs="Arial"/>
-        </w:rPr>
-        <w:t>}} on {{</w:t>
-      </w:r>
-      <w:proofErr w:type="spellStart"/>
-      <w:r>
-        <w:rPr>
-          <w:rFonts w:ascii="Arial" w:hAnsi="Arial" w:cs="Arial"/>
-        </w:rPr>
-        <w:t>orderDate</w:t>
-      </w:r>
-      <w:proofErr w:type="spellEnd"/>
-      <w:r>
-        <w:rPr>
-          <w:rFonts w:ascii="Arial" w:hAnsi="Arial" w:cs="Arial"/>
-        </w:rPr>
-        <w:t>}} at a hearing.</w:t>
-      </w:r>
-    </w:p>
-    <w:p>
-      <w:pPr>
-        <w:rPr>
-          <w:rFonts w:ascii="Arial" w:hAnsi="Arial" w:cs="Arial"/>
-        </w:rPr>
-      </w:pPr>
-    </w:p>
-    <w:p>
-      <w:pPr>
-        <w:rPr>
-          <w:rFonts w:ascii="Arial" w:hAnsi="Arial" w:cs="Arial"/>
-        </w:rPr>
-      </w:pPr>
-      <w:r>
-        <w:rPr>
-          <w:rFonts w:ascii="Arial" w:hAnsi="Arial" w:cs="Arial"/>
-        </w:rPr>
-        <w:t>The parties:</w:t>
-      </w:r>
-    </w:p>
-    <w:p>
-      <w:pPr>
-        <w:rPr>
-          <w:rFonts w:ascii="Arial" w:hAnsi="Arial" w:cs="Arial"/>
-        </w:rPr>
-      </w:pPr>
-      <w:r>
-        <w:rPr>
-          <w:rFonts w:ascii="Arial" w:hAnsi="Arial" w:cs="Arial"/>
-        </w:rPr>
-        <w:tab/>
-        <w:t xml:space="preserve">The applicant </w:t>
-      </w:r>
-      <w:proofErr w:type="gramStart"/>
-      <w:r>
-        <w:rPr>
-          <w:rFonts w:ascii="Arial" w:hAnsi="Arial" w:cs="Arial"/>
-        </w:rPr>
-        <w:t>is</w:t>
-      </w:r>
-      <w:r>
-        <w:rPr>
-          <w:rFonts w:ascii="Arial" w:hAnsi="Arial" w:cs="Arial"/>
-        </w:rPr>
-        <w:t xml:space="preserve">  </w:t>
-      </w:r>
-      <w:r>
-        <w:rPr>
-          <w:rFonts w:ascii="Arial" w:hAnsi="Arial" w:cs="Arial"/>
-        </w:rPr>
-        <w:t>{</w:t>
-      </w:r>
-      <w:proofErr w:type="gramEnd"/>
-      <w:r>
-        <w:rPr>
-          <w:rFonts w:ascii="Arial" w:hAnsi="Arial" w:cs="Arial"/>
-        </w:rPr>
-        <w:t>{</w:t>
-      </w:r>
-      <w:proofErr w:type="spellStart"/>
-      <w:r>
-        <w:rPr>
-          <w:rFonts w:ascii="Arial" w:hAnsi="Arial" w:cs="Arial"/>
-        </w:rPr>
-        <w:t>applicantName</w:t>
-      </w:r>
-      <w:proofErr w:type="spellEnd"/>
-      <w:r>
-        <w:rPr>
-          <w:rFonts w:ascii="Arial" w:hAnsi="Arial" w:cs="Arial"/>
-        </w:rPr>
-        <w:t>}}</w:t>
-      </w:r>
-      <w:r>
-        <w:rPr>
-          <w:rFonts w:ascii="Arial" w:hAnsi="Arial" w:cs="Arial"/>
-        </w:rPr>
-        <w:t xml:space="preserve"> </w:t>
-      </w:r>
-      <w:r>
-        <w:rPr>
-          <w:rFonts w:ascii="Arial" w:hAnsi="Arial" w:cs="Arial"/>
-        </w:rPr>
-        <w:t>{{</w:t>
-      </w:r>
-      <w:proofErr w:type="spellStart"/>
-      <w:r>
-        <w:rPr>
-          <w:rFonts w:ascii="Arial" w:hAnsi="Arial" w:cs="Arial"/>
-        </w:rPr>
-        <w:t>applicantRepresentativeClause</w:t>
-      </w:r>
-      <w:proofErr w:type="spellEnd"/>
-      <w:r>
-        <w:rPr>
-          <w:rFonts w:ascii="Arial" w:hAnsi="Arial" w:cs="Arial"/>
-        </w:rPr>
-        <w:t>}}</w:t>
-      </w:r>
-    </w:p>
-    <w:p>
-      <w:pPr>
-        <w:rPr>
-          <w:rFonts w:ascii="Arial" w:hAnsi="Arial" w:cs="Arial"/>
-        </w:rPr>
-      </w:pPr>
-    </w:p>
-    <w:tbl>
-      <w:tblPr>
-        <w:tblStyle w:val="TableGrid"/>
-        <w:tblW w:w="0" w:type="auto"/>
-        <w:tblBorders>
-          <w:top w:val="none" w:sz="0" w:space="0" w:color="auto"/>
-          <w:left w:val="none" w:sz="0" w:space="0" w:color="auto"/>
-          <w:bottom w:val="none" w:sz="0" w:space="0" w:color="auto"/>
-          <w:right w:val="none" w:sz="0" w:space="0" w:color="auto"/>
-          <w:insideH w:val="none" w:sz="0" w:space="0" w:color="auto"/>
-          <w:insideV w:val="none" w:sz="0" w:space="0" w:color="auto"/>
-        </w:tblBorders>
-        <w:tblLook w:val="04A0" w:firstRow="1" w:lastRow="0" w:firstColumn="1" w:lastColumn="0" w:noHBand="0" w:noVBand="1"/>
-      </w:tblPr>
-      <w:tblGrid>
-        <w:gridCol w:w="9026"/>
-      </w:tblGrid>
-      <w:tr>
-        <w:tc>
-          <w:tcPr>
-            <w:tcW w:w="9026" w:type="dxa"/>
-          </w:tcPr>
-          <w:p>
-            <w:pPr>
-              <w:rPr>
-                <w:rFonts w:ascii="Arial" w:hAnsi="Arial" w:cs="Arial"/>
-              </w:rPr>
-            </w:pPr>
-            <w:r>
-              <w:rPr>
-                <w:rFonts w:ascii="Arial" w:hAnsi="Arial" w:cs="Arial"/>
-              </w:rPr>
-              <w:t>{{respondents</w:t>
-            </w:r>
-            <w:proofErr w:type="gramStart"/>
-            <w:r>
-              <w:rPr>
-                <w:rFonts w:ascii="Arial" w:hAnsi="Arial" w:cs="Arial"/>
-              </w:rPr>
-              <w:t>}}The</w:t>
-            </w:r>
-            <w:proofErr w:type="gramEnd"/>
-            <w:r>
-              <w:rPr>
-                <w:rFonts w:ascii="Arial" w:hAnsi="Arial" w:cs="Arial"/>
-              </w:rPr>
-              <w:t xml:space="preserve"> [ordinal] respondent is [name], the [relationship]</w:t>
-            </w:r>
-            <w:r>
-              <w:rPr>
-                <w:rFonts w:ascii="Arial" w:hAnsi="Arial" w:cs="Arial"/>
-              </w:rPr>
-              <w:t xml:space="preserve"> </w:t>
-            </w:r>
-            <w:r>
-              <w:rPr>
-                <w:rFonts w:ascii="Arial" w:hAnsi="Arial" w:cs="Arial"/>
-              </w:rPr>
-              <w:t>[</w:t>
-            </w:r>
-            <w:proofErr w:type="spellStart"/>
-            <w:r>
-              <w:rPr>
-                <w:rFonts w:ascii="Arial" w:hAnsi="Arial" w:cs="Arial"/>
-              </w:rPr>
-              <w:t>representativeClause</w:t>
-            </w:r>
-            <w:proofErr w:type="spellEnd"/>
-            <w:r>
-              <w:rPr>
-                <w:rFonts w:ascii="Arial" w:hAnsi="Arial" w:cs="Arial"/>
-              </w:rPr>
-              <w:t>]</w:t>
-            </w:r>
-          </w:p>
-        </w:tc>
-      </w:tr>
-    </w:tbl>
-    <w:p>
-      <w:pPr>
-        <w:rPr>
-          <w:rFonts w:ascii="Arial" w:hAnsi="Arial" w:cs="Arial"/>
-        </w:rPr>
-      </w:pPr>
-    </w:p>
-    <w:p>
-      <w:pPr>
-        <w:rPr>
-          <w:rFonts w:ascii="Arial" w:hAnsi="Arial" w:cs="Arial"/>
-        </w:rPr>
-      </w:pPr>
-      <w:r>
-        <w:rPr>
-          <w:rFonts w:ascii="Arial" w:hAnsi="Arial" w:cs="Arial"/>
-        </w:rPr>
-        <w:t>{{</w:t>
-      </w:r>
-      <w:proofErr w:type="spellStart"/>
-      <w:r>
-        <w:rPr>
-          <w:rFonts w:ascii="Arial" w:hAnsi="Arial" w:cs="Arial"/>
-        </w:rPr>
-        <w:t>appointedGuardianClause</w:t>
-      </w:r>
-      <w:proofErr w:type="spellEnd"/>
-      <w:r>
-        <w:rPr>
-          <w:rFonts w:ascii="Arial" w:hAnsi="Arial" w:cs="Arial"/>
-        </w:rPr>
-        <w:t>}}</w:t>
-      </w:r>
-    </w:p>
-    <w:p>
-      <w:pPr>
-        <w:rPr>
-          <w:rFonts w:ascii="Arial" w:hAnsi="Arial" w:cs="Arial"/>
-        </w:rPr>
-      </w:pPr>
-    </w:p>
-    <w:p>
-      <w:pPr>
-        <w:rPr>
-          <w:rFonts w:ascii="Arial" w:hAnsi="Arial" w:cs="Arial"/>
-        </w:rPr>
-      </w:pPr>
-      <w:r>
-        <w:rPr>
-          <w:rFonts w:ascii="Arial" w:hAnsi="Arial" w:cs="Arial"/>
-        </w:rPr>
-        <w:t>{{</w:t>
-      </w:r>
-      <w:proofErr w:type="spellStart"/>
-      <w:r>
-        <w:rPr>
-          <w:rFonts w:ascii="Arial" w:hAnsi="Arial" w:cs="Arial"/>
-        </w:rPr>
-        <w:t>futureHearingClause</w:t>
-      </w:r>
-      <w:proofErr w:type="spellEnd"/>
-      <w:r>
-        <w:rPr>
-          <w:rFonts w:ascii="Arial" w:hAnsi="Arial" w:cs="Arial"/>
-        </w:rPr>
-        <w:t>}}</w:t>
-      </w:r>
     </w:p>
     <w:p>
       <w:pPr>

</xml_diff>

<commit_message>
FPVTL-2249 judge title and tests and change on header and wa order naming and addressing some lint warnings
</commit_message>
<xml_diff>
--- a/src/main/resources/templates/CustomOrderHeader.docx
+++ b/src/main/resources/templates/CustomOrderHeader.docx
@@ -734,7 +734,39 @@
         <w:rPr>
           <w:rFonts w:ascii="Arial" w:hAnsi="Arial" w:cs="Arial"/>
         </w:rPr>
-        <w:t>Before {{</w:t>
+        <w:t xml:space="preserve">Before </w:t>
+      </w:r>
+      <w:r>
+        <w:rPr>
+          <w:rFonts w:ascii="Arial" w:hAnsi="Arial" w:cs="Arial"/>
+        </w:rPr>
+        <w:t>{{</w:t>
+      </w:r>
+      <w:proofErr w:type="spellStart"/>
+      <w:r>
+        <w:rPr>
+          <w:rFonts w:ascii="Arial" w:hAnsi="Arial" w:cs="Arial"/>
+        </w:rPr>
+        <w:t>judgeTitle</w:t>
+      </w:r>
+      <w:proofErr w:type="spellEnd"/>
+      <w:r>
+        <w:rPr>
+          <w:rFonts w:ascii="Arial" w:hAnsi="Arial" w:cs="Arial"/>
+        </w:rPr>
+        <w:t>}}</w:t>
+      </w:r>
+      <w:r>
+        <w:rPr>
+          <w:rFonts w:ascii="Arial" w:hAnsi="Arial" w:cs="Arial"/>
+        </w:rPr>
+        <w:t xml:space="preserve"> </w:t>
+      </w:r>
+      <w:r>
+        <w:rPr>
+          <w:rFonts w:ascii="Arial" w:hAnsi="Arial" w:cs="Arial"/>
+        </w:rPr>
+        <w:t>{{</w:t>
       </w:r>
       <w:proofErr w:type="spellStart"/>
       <w:r>
@@ -861,7 +893,8 @@
     <w:tbl>
       <w:tblPr>
         <w:tblStyle w:val="TableGrid"/>
-        <w:tblW w:w="0" w:type="auto"/>
+        <w:tblW w:w="9026" w:type="dxa"/>
+        <w:tblInd w:w="540" w:type="dxa"/>
         <w:tblBorders>
           <w:top w:val="none" w:sz="0" w:space="0" w:color="auto"/>
           <w:left w:val="none" w:sz="0" w:space="0" w:color="auto"/>
@@ -929,6 +962,20 @@
           </w:p>
         </w:tc>
       </w:tr>
+      <w:tr>
+        <w:tc>
+          <w:tcPr>
+            <w:tcW w:w="9026" w:type="dxa"/>
+          </w:tcPr>
+          <w:p>
+            <w:pPr>
+              <w:rPr>
+                <w:rFonts w:ascii="Arial" w:hAnsi="Arial" w:cs="Arial"/>
+              </w:rPr>
+            </w:pPr>
+          </w:p>
+        </w:tc>
+      </w:tr>
     </w:tbl>
     <w:p>
       <w:pPr>
@@ -939,6 +986,7 @@
     </w:p>
     <w:p>
       <w:pPr>
+        <w:ind w:firstLine="720"/>
         <w:rPr>
           <w:rFonts w:ascii="Arial" w:hAnsi="Arial" w:cs="Arial"/>
         </w:rPr>

</xml_diff>

<commit_message>
FPVTL-2249 logging on judge title and WA task not working, fix for date showing current when not hearing and also 'on the papers'
</commit_message>
<xml_diff>
--- a/src/main/resources/templates/CustomOrderHeader.docx
+++ b/src/main/resources/templates/CustomOrderHeader.docx
@@ -216,22 +216,54 @@
                 <w:rFonts w:ascii="Arial" w:hAnsi="Arial" w:cs="Arial"/>
                 <w:sz w:val="32"/>
               </w:rPr>
-              <w:t>{{familymanLabel}}</w:t>
-            </w:r>
-          </w:p>
-          <w:p>
-            <w:pPr>
-              <w:rPr>
-                <w:rFonts w:ascii="Arial" w:hAnsi="Arial" w:cs="Arial"/>
-                <w:sz w:val="32"/>
-              </w:rPr>
-            </w:pPr>
-            <w:r>
-              <w:rPr>
-                <w:rFonts w:ascii="Arial" w:hAnsi="Arial" w:cs="Arial"/>
-                <w:sz w:val="32"/>
-              </w:rPr>
-              <w:t>{{familymanCaseNumber}}</w:t>
+              <w:t>{{</w:t>
+            </w:r>
+            <w:proofErr w:type="spellStart"/>
+            <w:r>
+              <w:rPr>
+                <w:rFonts w:ascii="Arial" w:hAnsi="Arial" w:cs="Arial"/>
+                <w:sz w:val="32"/>
+              </w:rPr>
+              <w:t>familymanLabel</w:t>
+            </w:r>
+            <w:proofErr w:type="spellEnd"/>
+            <w:r>
+              <w:rPr>
+                <w:rFonts w:ascii="Arial" w:hAnsi="Arial" w:cs="Arial"/>
+                <w:sz w:val="32"/>
+              </w:rPr>
+              <w:t>}}</w:t>
+            </w:r>
+          </w:p>
+          <w:p>
+            <w:pPr>
+              <w:rPr>
+                <w:rFonts w:ascii="Arial" w:hAnsi="Arial" w:cs="Arial"/>
+                <w:sz w:val="32"/>
+              </w:rPr>
+            </w:pPr>
+            <w:r>
+              <w:rPr>
+                <w:rFonts w:ascii="Arial" w:hAnsi="Arial" w:cs="Arial"/>
+                <w:sz w:val="32"/>
+              </w:rPr>
+              <w:t>{{</w:t>
+            </w:r>
+            <w:proofErr w:type="spellStart"/>
+            <w:r>
+              <w:rPr>
+                <w:rFonts w:ascii="Arial" w:hAnsi="Arial" w:cs="Arial"/>
+                <w:sz w:val="32"/>
+              </w:rPr>
+              <w:t>familymanCaseNumber</w:t>
+            </w:r>
+            <w:proofErr w:type="spellEnd"/>
+            <w:r>
+              <w:rPr>
+                <w:rFonts w:ascii="Arial" w:hAnsi="Arial" w:cs="Arial"/>
+                <w:sz w:val="32"/>
+              </w:rPr>
+              <w:t>}}</w:t>
             </w:r>
           </w:p>
           <w:p>
@@ -780,21 +812,33 @@
         <w:rPr>
           <w:rFonts w:ascii="Arial" w:hAnsi="Arial" w:cs="Arial"/>
         </w:rPr>
-        <w:t>}} on {{</w:t>
+        <w:t xml:space="preserve">}} on </w:t>
+      </w:r>
+      <w:r>
+        <w:rPr>
+          <w:rFonts w:ascii="Arial" w:hAnsi="Arial" w:cs="Arial"/>
+        </w:rPr>
+        <w:t>{{</w:t>
       </w:r>
       <w:proofErr w:type="spellStart"/>
       <w:r>
         <w:rPr>
           <w:rFonts w:ascii="Arial" w:hAnsi="Arial" w:cs="Arial"/>
         </w:rPr>
-        <w:t>orderDate</w:t>
+        <w:t>hearingOrPapers</w:t>
       </w:r>
       <w:proofErr w:type="spellEnd"/>
       <w:r>
         <w:rPr>
           <w:rFonts w:ascii="Arial" w:hAnsi="Arial" w:cs="Arial"/>
         </w:rPr>
-        <w:t>}} at a hearing.</w:t>
+        <w:t>}}</w:t>
+      </w:r>
+      <w:r>
+        <w:rPr>
+          <w:rFonts w:ascii="Arial" w:hAnsi="Arial" w:cs="Arial"/>
+        </w:rPr>
+        <w:t>.</w:t>
       </w:r>
     </w:p>
     <w:p>
@@ -977,48 +1021,6 @@
         </w:tc>
       </w:tr>
     </w:tbl>
-    <w:p>
-      <w:pPr>
-        <w:rPr>
-          <w:rFonts w:ascii="Arial" w:hAnsi="Arial" w:cs="Arial"/>
-        </w:rPr>
-      </w:pPr>
-    </w:p>
-    <w:p>
-      <w:pPr>
-        <w:ind w:firstLine="720"/>
-        <w:rPr>
-          <w:rFonts w:ascii="Arial" w:hAnsi="Arial" w:cs="Arial"/>
-        </w:rPr>
-      </w:pPr>
-      <w:r>
-        <w:rPr>
-          <w:rFonts w:ascii="Arial" w:hAnsi="Arial" w:cs="Arial"/>
-        </w:rPr>
-        <w:t>{{</w:t>
-      </w:r>
-      <w:proofErr w:type="spellStart"/>
-      <w:r>
-        <w:rPr>
-          <w:rFonts w:ascii="Arial" w:hAnsi="Arial" w:cs="Arial"/>
-        </w:rPr>
-        <w:t>appointedGuardianClause</w:t>
-      </w:r>
-      <w:proofErr w:type="spellEnd"/>
-      <w:r>
-        <w:rPr>
-          <w:rFonts w:ascii="Arial" w:hAnsi="Arial" w:cs="Arial"/>
-        </w:rPr>
-        <w:t>}}</w:t>
-      </w:r>
-    </w:p>
-    <w:p>
-      <w:pPr>
-        <w:rPr>
-          <w:rFonts w:ascii="Arial" w:hAnsi="Arial" w:cs="Arial"/>
-        </w:rPr>
-      </w:pPr>
-    </w:p>
     <w:p>
       <w:pPr>
         <w:rPr>

</xml_diff>

<commit_message>
FPVTL-2249 fix a space that Abi spotted
</commit_message>
<xml_diff>
--- a/src/main/resources/templates/CustomOrderHeader.docx
+++ b/src/main/resources/templates/CustomOrderHeader.docx
@@ -894,23 +894,19 @@
         <w:t>applicantName</w:t>
       </w:r>
       <w:proofErr w:type="spellEnd"/>
-      <w:r>
-        <w:rPr>
-          <w:rFonts w:ascii="Arial" w:hAnsi="Arial" w:cs="Arial"/>
-        </w:rPr>
-        <w:t>}}</w:t>
-      </w:r>
-      <w:r>
-        <w:rPr>
-          <w:rFonts w:ascii="Arial" w:hAnsi="Arial" w:cs="Arial"/>
-        </w:rPr>
-        <w:t xml:space="preserve"> </w:t>
-      </w:r>
-      <w:r>
-        <w:rPr>
-          <w:rFonts w:ascii="Arial" w:hAnsi="Arial" w:cs="Arial"/>
-        </w:rPr>
-        <w:t>{{</w:t>
+      <w:proofErr w:type="gramStart"/>
+      <w:r>
+        <w:rPr>
+          <w:rFonts w:ascii="Arial" w:hAnsi="Arial" w:cs="Arial"/>
+        </w:rPr>
+        <w:t>}}{</w:t>
+      </w:r>
+      <w:proofErr w:type="gramEnd"/>
+      <w:r>
+        <w:rPr>
+          <w:rFonts w:ascii="Arial" w:hAnsi="Arial" w:cs="Arial"/>
+        </w:rPr>
+        <w:t>{</w:t>
       </w:r>
       <w:proofErr w:type="spellStart"/>
       <w:r>
@@ -987,7 +983,7 @@
               <w:rPr>
                 <w:rFonts w:ascii="Arial" w:hAnsi="Arial" w:cs="Arial"/>
               </w:rPr>
-              <w:t>] [</w:t>
+              <w:t>][</w:t>
             </w:r>
             <w:proofErr w:type="spellStart"/>
             <w:r>

</xml_diff>

<commit_message>
FPVTL-2249 fix the orderDate going awol after the on the papers change
</commit_message>
<xml_diff>
--- a/src/main/resources/templates/CustomOrderHeader.docx
+++ b/src/main/resources/templates/CustomOrderHeader.docx
@@ -825,7 +825,7 @@
         <w:rPr>
           <w:rFonts w:ascii="Arial" w:hAnsi="Arial" w:cs="Arial"/>
         </w:rPr>
-        <w:t>hearingOrPapers</w:t>
+        <w:t>orderDate</w:t>
       </w:r>
       <w:proofErr w:type="spellEnd"/>
       <w:r>
@@ -833,6 +833,32 @@
           <w:rFonts w:ascii="Arial" w:hAnsi="Arial" w:cs="Arial"/>
         </w:rPr>
         <w:t>}}</w:t>
+      </w:r>
+      <w:r>
+        <w:rPr>
+          <w:rFonts w:ascii="Arial" w:hAnsi="Arial" w:cs="Arial"/>
+        </w:rPr>
+        <w:t xml:space="preserve"> </w:t>
+      </w:r>
+      <w:r>
+        <w:rPr>
+          <w:rFonts w:ascii="Arial" w:hAnsi="Arial" w:cs="Arial"/>
+        </w:rPr>
+        <w:t>{</w:t>
+      </w:r>
+      <w:proofErr w:type="spellStart"/>
+      <w:r>
+        <w:rPr>
+          <w:rFonts w:ascii="Arial" w:hAnsi="Arial" w:cs="Arial"/>
+        </w:rPr>
+        <w:t>{hearingOrPaper</w:t>
+      </w:r>
+      <w:proofErr w:type="spellEnd"/>
+      <w:r>
+        <w:rPr>
+          <w:rFonts w:ascii="Arial" w:hAnsi="Arial" w:cs="Arial"/>
+        </w:rPr>
+        <w:t>s}}</w:t>
       </w:r>
       <w:r>
         <w:rPr>

</xml_diff>

<commit_message>
FPVTL-2249 hide children table when no children on fl401 case
</commit_message>
<xml_diff>
--- a/src/main/resources/templates/CustomOrderHeader.docx
+++ b/src/main/resources/templates/CustomOrderHeader.docx
@@ -393,6 +393,34 @@
                 <w:rFonts w:ascii="Arial" w:hAnsi="Arial" w:cs="Arial"/>
               </w:rPr>
             </w:pPr>
+            <w:r>
+              <w:rPr>
+                <w:rFonts w:ascii="Arial" w:hAnsi="Arial" w:cs="Arial"/>
+              </w:rPr>
+              <w:t>{</w:t>
+            </w:r>
+            <w:proofErr w:type="gramStart"/>
+            <w:r>
+              <w:rPr>
+                <w:rFonts w:ascii="Arial" w:hAnsi="Arial" w:cs="Arial"/>
+              </w:rPr>
+              <w:t>{?</w:t>
+            </w:r>
+            <w:proofErr w:type="spellStart"/>
+            <w:r>
+              <w:rPr>
+                <w:rFonts w:ascii="Arial" w:hAnsi="Arial" w:cs="Arial"/>
+              </w:rPr>
+              <w:t>hasChildren</w:t>
+            </w:r>
+            <w:proofErr w:type="spellEnd"/>
+            <w:proofErr w:type="gramEnd"/>
+            <w:r>
+              <w:rPr>
+                <w:rFonts w:ascii="Arial" w:hAnsi="Arial" w:cs="Arial"/>
+              </w:rPr>
+              <w:t>}}</w:t>
+            </w:r>
           </w:p>
         </w:tc>
         <w:tc>
@@ -663,6 +691,12 @@
                 <w:rFonts w:ascii="Arial" w:hAnsi="Arial" w:cs="Arial"/>
               </w:rPr>
             </w:pPr>
+            <w:r>
+              <w:rPr>
+                <w:rFonts w:ascii="Arial" w:hAnsi="Arial" w:cs="Arial"/>
+              </w:rPr>
+              <w:t>{{/hasChildren}}</w:t>
+            </w:r>
           </w:p>
         </w:tc>
         <w:tc>

</xml_diff>

<commit_message>
FPVTL-2249 fixed the fl401 withempty kid table on header for Rob, also incorp code review suggestions
</commit_message>
<xml_diff>
--- a/src/main/resources/templates/CustomOrderHeader.docx
+++ b/src/main/resources/templates/CustomOrderHeader.docx
@@ -367,93 +367,33 @@
           </w:p>
         </w:tc>
       </w:tr>
-      <w:tr>
-        <w:tc>
-          <w:tcPr>
-            <w:tcW w:w="1418" w:type="dxa"/>
-          </w:tcPr>
-          <w:p>
-            <w:pPr>
-              <w:rPr>
-                <w:rFonts w:ascii="Arial" w:hAnsi="Arial" w:cs="Arial"/>
-              </w:rPr>
-            </w:pPr>
-          </w:p>
-        </w:tc>
-        <w:tc>
-          <w:tcPr>
-            <w:tcW w:w="3118" w:type="dxa"/>
-            <w:tcBorders>
-              <w:top w:val="single" w:sz="4" w:space="0" w:color="000000"/>
-            </w:tcBorders>
-          </w:tcPr>
-          <w:p>
-            <w:pPr>
-              <w:rPr>
-                <w:rFonts w:ascii="Arial" w:hAnsi="Arial" w:cs="Arial"/>
-              </w:rPr>
-            </w:pPr>
-            <w:r>
-              <w:rPr>
-                <w:rFonts w:ascii="Arial" w:hAnsi="Arial" w:cs="Arial"/>
-              </w:rPr>
-              <w:t>{</w:t>
-            </w:r>
-            <w:proofErr w:type="gramStart"/>
-            <w:r>
-              <w:rPr>
-                <w:rFonts w:ascii="Arial" w:hAnsi="Arial" w:cs="Arial"/>
-              </w:rPr>
-              <w:t>{?</w:t>
-            </w:r>
-            <w:proofErr w:type="spellStart"/>
-            <w:r>
-              <w:rPr>
-                <w:rFonts w:ascii="Arial" w:hAnsi="Arial" w:cs="Arial"/>
-              </w:rPr>
-              <w:t>hasChildren</w:t>
-            </w:r>
-            <w:proofErr w:type="spellEnd"/>
-            <w:proofErr w:type="gramEnd"/>
-            <w:r>
-              <w:rPr>
-                <w:rFonts w:ascii="Arial" w:hAnsi="Arial" w:cs="Arial"/>
-              </w:rPr>
-              <w:t>}}</w:t>
-            </w:r>
-          </w:p>
-        </w:tc>
-        <w:tc>
-          <w:tcPr>
-            <w:tcW w:w="2221" w:type="dxa"/>
-            <w:tcBorders>
-              <w:top w:val="single" w:sz="4" w:space="0" w:color="000000"/>
-            </w:tcBorders>
-          </w:tcPr>
-          <w:p>
-            <w:pPr>
-              <w:rPr>
-                <w:rFonts w:ascii="Arial" w:hAnsi="Arial" w:cs="Arial"/>
-              </w:rPr>
-            </w:pPr>
-          </w:p>
-        </w:tc>
-        <w:tc>
-          <w:tcPr>
-            <w:tcW w:w="2253" w:type="dxa"/>
-            <w:tcBorders>
-              <w:top w:val="single" w:sz="4" w:space="0" w:color="000000"/>
-            </w:tcBorders>
-          </w:tcPr>
-          <w:p>
-            <w:pPr>
-              <w:rPr>
-                <w:rFonts w:ascii="Arial" w:hAnsi="Arial" w:cs="Arial"/>
-              </w:rPr>
-            </w:pPr>
-          </w:p>
-        </w:tc>
-      </w:tr>
+    </w:tbl>
+    <w:p>
+      <w:r>
+        <w:t>{{?hasChildren}}</w:t>
+      </w:r>
+    </w:p>
+    <w:tbl>
+      <w:tblPr>
+        <w:tblW w:w="9010" w:type="dxa"/>
+        <w:tblInd w:w="108" w:type="dxa"/>
+        <w:tblBorders>
+          <w:top w:val="single" w:sz="4" w:space="0" w:color="000000"/>
+          <w:left w:val="nil"/>
+          <w:bottom w:val="single" w:sz="4" w:space="0" w:color="000000"/>
+          <w:right w:val="nil"/>
+          <w:insideH w:val="nil"/>
+          <w:insideV w:val="nil"/>
+        </w:tblBorders>
+        <w:tblLayout w:type="fixed"/>
+        <w:tblLook w:val="0400" w:firstRow="0" w:lastRow="0" w:firstColumn="0" w:lastColumn="0" w:noHBand="0" w:noVBand="1"/>
+      </w:tblPr>
+      <w:tblGrid>
+        <w:gridCol w:w="1418"/>
+        <w:gridCol w:w="3118"/>
+        <w:gridCol w:w="2221"/>
+        <w:gridCol w:w="2253"/>
+      </w:tblGrid>
       <w:tr>
         <w:tc>
           <w:tcPr>
@@ -668,63 +608,33 @@
           </w:p>
         </w:tc>
       </w:tr>
-      <w:tr>
-        <w:tc>
-          <w:tcPr>
-            <w:tcW w:w="1418" w:type="dxa"/>
-          </w:tcPr>
-          <w:p>
-            <w:pPr>
-              <w:rPr>
-                <w:rFonts w:ascii="Arial" w:hAnsi="Arial" w:cs="Arial"/>
-              </w:rPr>
-            </w:pPr>
-          </w:p>
-        </w:tc>
-        <w:tc>
-          <w:tcPr>
-            <w:tcW w:w="3118" w:type="dxa"/>
-          </w:tcPr>
-          <w:p>
-            <w:pPr>
-              <w:rPr>
-                <w:rFonts w:ascii="Arial" w:hAnsi="Arial" w:cs="Arial"/>
-              </w:rPr>
-            </w:pPr>
-            <w:r>
-              <w:rPr>
-                <w:rFonts w:ascii="Arial" w:hAnsi="Arial" w:cs="Arial"/>
-              </w:rPr>
-              <w:t>{{/hasChildren}}</w:t>
-            </w:r>
-          </w:p>
-        </w:tc>
-        <w:tc>
-          <w:tcPr>
-            <w:tcW w:w="2221" w:type="dxa"/>
-          </w:tcPr>
-          <w:p>
-            <w:pPr>
-              <w:rPr>
-                <w:rFonts w:ascii="Arial" w:hAnsi="Arial" w:cs="Arial"/>
-              </w:rPr>
-            </w:pPr>
-          </w:p>
-        </w:tc>
-        <w:tc>
-          <w:tcPr>
-            <w:tcW w:w="2253" w:type="dxa"/>
-          </w:tcPr>
-          <w:p>
-            <w:pPr>
-              <w:rPr>
-                <w:rFonts w:ascii="Arial" w:hAnsi="Arial" w:cs="Arial"/>
-                <w:color w:val="FF0000"/>
-              </w:rPr>
-            </w:pPr>
-          </w:p>
-        </w:tc>
-      </w:tr>
+    </w:tbl>
+    <w:p>
+      <w:r>
+        <w:t>{{/hasChildren}}</w:t>
+      </w:r>
+    </w:p>
+    <w:tbl>
+      <w:tblPr>
+        <w:tblW w:w="9010" w:type="dxa"/>
+        <w:tblInd w:w="108" w:type="dxa"/>
+        <w:tblBorders>
+          <w:top w:val="single" w:sz="4" w:space="0" w:color="000000"/>
+          <w:left w:val="nil"/>
+          <w:bottom w:val="single" w:sz="4" w:space="0" w:color="000000"/>
+          <w:right w:val="nil"/>
+          <w:insideH w:val="nil"/>
+          <w:insideV w:val="nil"/>
+        </w:tblBorders>
+        <w:tblLayout w:type="fixed"/>
+        <w:tblLook w:val="0400" w:firstRow="0" w:lastRow="0" w:firstColumn="0" w:lastColumn="0" w:noHBand="0" w:noVBand="1"/>
+      </w:tblPr>
+      <w:tblGrid>
+        <w:gridCol w:w="1418"/>
+        <w:gridCol w:w="3118"/>
+        <w:gridCol w:w="2221"/>
+        <w:gridCol w:w="2253"/>
+      </w:tblGrid>
       <w:tr>
         <w:tc>
           <w:tcPr>

</xml_diff>

<commit_message>
FPVTL-2249 change so that legal advisor gets filled in as legal advisor on the header and also check if it's legal adviser logged in and fill in the right spot accordingly
</commit_message>
<xml_diff>
--- a/src/main/resources/templates/CustomOrderHeader.docx
+++ b/src/main/resources/templates/CustomOrderHeader.docx
@@ -41,7 +41,7 @@
                 <w:noProof/>
               </w:rPr>
               <w:drawing>
-                <wp:inline distT="0" distB="0" distL="0" distR="0" wp14:anchorId="29ED4ACA" wp14:editId="0F5AE6A0">
+                <wp:inline distT="0" distB="0" distL="0" distR="0" wp14:anchorId="5F399D22" wp14:editId="404E0DFF">
                   <wp:extent cx="855573" cy="712381"/>
                   <wp:effectExtent l="0" t="0" r="0" b="0"/>
                   <wp:docPr id="2" name="Picture 2" descr="A black and white logo&#10;&#10;Description automatically generated"/>
@@ -294,9 +294,7 @@
       </w:tblPr>
       <w:tblGrid>
         <w:gridCol w:w="1418"/>
-        <w:gridCol w:w="3118"/>
-        <w:gridCol w:w="2221"/>
-        <w:gridCol w:w="2253"/>
+        <w:gridCol w:w="7592"/>
       </w:tblGrid>
       <w:tr>
         <w:tc>
@@ -314,7 +312,6 @@
         <w:tc>
           <w:tcPr>
             <w:tcW w:w="7592" w:type="dxa"/>
-            <w:gridSpan w:val="3"/>
             <w:tcBorders>
               <w:top w:val="single" w:sz="4" w:space="0" w:color="000000"/>
               <w:bottom w:val="single" w:sz="4" w:space="0" w:color="000000"/>
@@ -756,7 +753,19 @@
         <w:rPr>
           <w:rFonts w:ascii="Arial" w:hAnsi="Arial" w:cs="Arial"/>
         </w:rPr>
-        <w:t xml:space="preserve">}} on </w:t>
+        <w:t>}}</w:t>
+      </w:r>
+      <w:r>
+        <w:rPr>
+          <w:rFonts w:ascii="Arial" w:hAnsi="Arial" w:cs="Arial"/>
+        </w:rPr>
+        <w:t>{{sittingWithLegalAdviser}}</w:t>
+      </w:r>
+      <w:r>
+        <w:rPr>
+          <w:rFonts w:ascii="Arial" w:hAnsi="Arial" w:cs="Arial"/>
+        </w:rPr>
+        <w:t xml:space="preserve"> on </w:t>
       </w:r>
       <w:r>
         <w:rPr>
@@ -788,21 +797,21 @@
         <w:rPr>
           <w:rFonts w:ascii="Arial" w:hAnsi="Arial" w:cs="Arial"/>
         </w:rPr>
-        <w:t>{</w:t>
+        <w:t>{{</w:t>
       </w:r>
       <w:proofErr w:type="spellStart"/>
       <w:r>
         <w:rPr>
           <w:rFonts w:ascii="Arial" w:hAnsi="Arial" w:cs="Arial"/>
         </w:rPr>
-        <w:t>{hearingOrPaper</w:t>
+        <w:t>hearingOrPapers</w:t>
       </w:r>
       <w:proofErr w:type="spellEnd"/>
       <w:r>
         <w:rPr>
           <w:rFonts w:ascii="Arial" w:hAnsi="Arial" w:cs="Arial"/>
         </w:rPr>
-        <w:t>s}}</w:t>
+        <w:t>}}</w:t>
       </w:r>
       <w:r>
         <w:rPr>

</xml_diff>

<commit_message>
Enable multiple applicants to be handled
</commit_message>
<xml_diff>
--- a/src/main/resources/templates/CustomOrderHeader.docx
+++ b/src/main/resources/templates/CustomOrderHeader.docx
@@ -1,6 +1,6 @@
 
 <file path=word/document.xml><?xml version="1.0" encoding="utf-8"?>
-<w:document xmlns:wpc="http://schemas.microsoft.com/office/word/2010/wordprocessingCanvas" xmlns:cx="http://schemas.microsoft.com/office/drawing/2014/chartex" xmlns:cx1="http://schemas.microsoft.com/office/drawing/2015/9/8/chartex" xmlns:cx2="http://schemas.microsoft.com/office/drawing/2015/10/21/chartex" xmlns:cx3="http://schemas.microsoft.com/office/drawing/2016/5/9/chartex" xmlns:cx4="http://schemas.microsoft.com/office/drawing/2016/5/10/chartex" xmlns:cx5="http://schemas.microsoft.com/office/drawing/2016/5/11/chartex" xmlns:cx6="http://schemas.microsoft.com/office/drawing/2016/5/12/chartex" xmlns:cx7="http://schemas.microsoft.com/office/drawing/2016/5/13/chartex" xmlns:cx8="http://schemas.microsoft.com/office/drawing/2016/5/14/chartex" xmlns:mc="http://schemas.openxmlformats.org/markup-compatibility/2006" xmlns:aink="http://schemas.microsoft.com/office/drawing/2016/ink" xmlns:am3d="http://schemas.microsoft.com/office/drawing/2017/model3d" xmlns:o="urn:schemas-microsoft-com:office:office" xmlns:oel="http://schemas.microsoft.com/office/2019/extlst" xmlns:r="http://schemas.openxmlformats.org/officeDocument/2006/relationships" xmlns:m="http://schemas.openxmlformats.org/officeDocument/2006/math" xmlns:v="urn:schemas-microsoft-com:vml" xmlns:wp14="http://schemas.microsoft.com/office/word/2010/wordprocessingDrawing" xmlns:wp="http://schemas.openxmlformats.org/drawingml/2006/wordprocessingDrawing" xmlns:w10="urn:schemas-microsoft-com:office:word" xmlns:w="http://schemas.openxmlformats.org/wordprocessingml/2006/main" xmlns:w14="http://schemas.microsoft.com/office/word/2010/wordml" xmlns:w15="http://schemas.microsoft.com/office/word/2012/wordml" xmlns:w16cex="http://schemas.microsoft.com/office/word/2018/wordml/cex" xmlns:w16cid="http://schemas.microsoft.com/office/word/2016/wordml/cid" xmlns:w16="http://schemas.microsoft.com/office/word/2018/wordml" xmlns:w16sdtdh="http://schemas.microsoft.com/office/word/2020/wordml/sdtdatahash" xmlns:w16se="http://schemas.microsoft.com/office/word/2015/wordml/symex" xmlns:wpg="http://schemas.microsoft.com/office/word/2010/wordprocessingGroup" xmlns:wpi="http://schemas.microsoft.com/office/word/2010/wordprocessingInk" xmlns:wne="http://schemas.microsoft.com/office/word/2006/wordml" xmlns:wps="http://schemas.microsoft.com/office/word/2010/wordprocessingShape" mc:Ignorable="w14 w15 w16se w16cid w16 w16cex w16sdtdh wp14">
+<w:document xmlns:wpc="http://schemas.microsoft.com/office/word/2010/wordprocessingCanvas" xmlns:cx="http://schemas.microsoft.com/office/drawing/2014/chartex" xmlns:cx1="http://schemas.microsoft.com/office/drawing/2015/9/8/chartex" xmlns:cx2="http://schemas.microsoft.com/office/drawing/2015/10/21/chartex" xmlns:cx3="http://schemas.microsoft.com/office/drawing/2016/5/9/chartex" xmlns:cx4="http://schemas.microsoft.com/office/drawing/2016/5/10/chartex" xmlns:cx5="http://schemas.microsoft.com/office/drawing/2016/5/11/chartex" xmlns:cx6="http://schemas.microsoft.com/office/drawing/2016/5/12/chartex" xmlns:cx7="http://schemas.microsoft.com/office/drawing/2016/5/13/chartex" xmlns:cx8="http://schemas.microsoft.com/office/drawing/2016/5/14/chartex" xmlns:mc="http://schemas.openxmlformats.org/markup-compatibility/2006" xmlns:aink="http://schemas.microsoft.com/office/drawing/2016/ink" xmlns:am3d="http://schemas.microsoft.com/office/drawing/2017/model3d" xmlns:o="urn:schemas-microsoft-com:office:office" xmlns:oel="http://schemas.microsoft.com/office/2019/extlst" xmlns:r="http://schemas.openxmlformats.org/officeDocument/2006/relationships" xmlns:m="http://schemas.openxmlformats.org/officeDocument/2006/math" xmlns:v="urn:schemas-microsoft-com:vml" xmlns:wp14="http://schemas.microsoft.com/office/word/2010/wordprocessingDrawing" xmlns:wp="http://schemas.openxmlformats.org/drawingml/2006/wordprocessingDrawing" xmlns:w10="urn:schemas-microsoft-com:office:word" xmlns:w="http://schemas.openxmlformats.org/wordprocessingml/2006/main" xmlns:w14="http://schemas.microsoft.com/office/word/2010/wordml" xmlns:w15="http://schemas.microsoft.com/office/word/2012/wordml" xmlns:w16cex="http://schemas.microsoft.com/office/word/2018/wordml/cex" xmlns:w16cid="http://schemas.microsoft.com/office/word/2016/wordml/cid" xmlns:w16="http://schemas.microsoft.com/office/word/2018/wordml" xmlns:w16du="http://schemas.microsoft.com/office/word/2023/wordml/word16du" xmlns:w16sdtdh="http://schemas.microsoft.com/office/word/2020/wordml/sdtdatahash" xmlns:w16sdtfl="http://schemas.microsoft.com/office/word/2024/wordml/sdtformatlock" xmlns:w16se="http://schemas.microsoft.com/office/word/2015/wordml/symex" xmlns:wpg="http://schemas.microsoft.com/office/word/2010/wordprocessingGroup" xmlns:wpi="http://schemas.microsoft.com/office/word/2010/wordprocessingInk" xmlns:wne="http://schemas.microsoft.com/office/word/2006/wordml" xmlns:wps="http://schemas.microsoft.com/office/word/2010/wordprocessingShape" mc:Ignorable="w14 w15 w16se w16cid w16 w16cex w16sdtdh w16sdtfl w16du wp14">
   <w:body>
     <w:tbl>
       <w:tblPr>
@@ -41,7 +41,7 @@
                 <w:noProof/>
               </w:rPr>
               <w:drawing>
-                <wp:inline distT="0" distB="0" distL="0" distR="0" wp14:anchorId="5F399D22" wp14:editId="404E0DFF">
+                <wp:inline distT="0" distB="0" distL="0" distR="0" wp14:anchorId="5F399D22" wp14:editId="34D3FC84">
                   <wp:extent cx="855573" cy="712381"/>
                   <wp:effectExtent l="0" t="0" r="0" b="0"/>
                   <wp:docPr id="2" name="Picture 2" descr="A black and white logo&#10;&#10;Description automatically generated"/>
@@ -759,7 +759,21 @@
         <w:rPr>
           <w:rFonts w:ascii="Arial" w:hAnsi="Arial" w:cs="Arial"/>
         </w:rPr>
-        <w:t>{{sittingWithLegalAdviser}}</w:t>
+        <w:t>{{</w:t>
+      </w:r>
+      <w:proofErr w:type="spellStart"/>
+      <w:r>
+        <w:rPr>
+          <w:rFonts w:ascii="Arial" w:hAnsi="Arial" w:cs="Arial"/>
+        </w:rPr>
+        <w:t>sittingWithLegalAdviser</w:t>
+      </w:r>
+      <w:proofErr w:type="spellEnd"/>
+      <w:r>
+        <w:rPr>
+          <w:rFonts w:ascii="Arial" w:hAnsi="Arial" w:cs="Arial"/>
+        </w:rPr>
+        <w:t>}}</w:t>
       </w:r>
       <w:r>
         <w:rPr>
@@ -840,68 +854,117 @@
         <w:t>The parties:</w:t>
       </w:r>
     </w:p>
-    <w:p>
-      <w:pPr>
-        <w:rPr>
-          <w:rFonts w:ascii="Arial" w:hAnsi="Arial" w:cs="Arial"/>
-        </w:rPr>
-      </w:pPr>
-      <w:r>
-        <w:rPr>
-          <w:rFonts w:ascii="Arial" w:hAnsi="Arial" w:cs="Arial"/>
-        </w:rPr>
-        <w:tab/>
-        <w:t>The applicant is</w:t>
-      </w:r>
-      <w:r>
-        <w:rPr>
-          <w:rFonts w:ascii="Arial" w:hAnsi="Arial" w:cs="Arial"/>
-        </w:rPr>
-        <w:t xml:space="preserve"> </w:t>
-      </w:r>
-      <w:r>
-        <w:rPr>
-          <w:rFonts w:ascii="Arial" w:hAnsi="Arial" w:cs="Arial"/>
-        </w:rPr>
-        <w:t>{{</w:t>
-      </w:r>
-      <w:proofErr w:type="spellStart"/>
-      <w:r>
-        <w:rPr>
-          <w:rFonts w:ascii="Arial" w:hAnsi="Arial" w:cs="Arial"/>
-        </w:rPr>
-        <w:t>applicantName</w:t>
-      </w:r>
-      <w:proofErr w:type="spellEnd"/>
-      <w:proofErr w:type="gramStart"/>
-      <w:r>
-        <w:rPr>
-          <w:rFonts w:ascii="Arial" w:hAnsi="Arial" w:cs="Arial"/>
-        </w:rPr>
-        <w:t>}}{</w:t>
-      </w:r>
-      <w:proofErr w:type="gramEnd"/>
-      <w:r>
-        <w:rPr>
-          <w:rFonts w:ascii="Arial" w:hAnsi="Arial" w:cs="Arial"/>
-        </w:rPr>
-        <w:t>{</w:t>
-      </w:r>
-      <w:proofErr w:type="spellStart"/>
-      <w:r>
-        <w:rPr>
-          <w:rFonts w:ascii="Arial" w:hAnsi="Arial" w:cs="Arial"/>
-        </w:rPr>
-        <w:t>applicantRepresentativeClause</w:t>
-      </w:r>
-      <w:proofErr w:type="spellEnd"/>
-      <w:r>
-        <w:rPr>
-          <w:rFonts w:ascii="Arial" w:hAnsi="Arial" w:cs="Arial"/>
-        </w:rPr>
-        <w:t>}}</w:t>
-      </w:r>
-    </w:p>
+    <w:tbl>
+      <w:tblPr>
+        <w:tblStyle w:val="TableGrid"/>
+        <w:tblW w:w="9026" w:type="dxa"/>
+        <w:tblInd w:w="540" w:type="dxa"/>
+        <w:tblBorders>
+          <w:top w:val="none" w:sz="0" w:space="0" w:color="auto"/>
+          <w:left w:val="none" w:sz="0" w:space="0" w:color="auto"/>
+          <w:bottom w:val="none" w:sz="0" w:space="0" w:color="auto"/>
+          <w:right w:val="none" w:sz="0" w:space="0" w:color="auto"/>
+          <w:insideH w:val="none" w:sz="0" w:space="0" w:color="auto"/>
+          <w:insideV w:val="none" w:sz="0" w:space="0" w:color="auto"/>
+        </w:tblBorders>
+        <w:tblLook w:val="04A0" w:firstRow="1" w:lastRow="0" w:firstColumn="1" w:lastColumn="0" w:noHBand="0" w:noVBand="1"/>
+      </w:tblPr>
+      <w:tblGrid>
+        <w:gridCol w:w="9026"/>
+      </w:tblGrid>
+      <w:tr>
+        <w:tc>
+          <w:tcPr>
+            <w:tcW w:w="9026" w:type="dxa"/>
+          </w:tcPr>
+          <w:p>
+            <w:pPr>
+              <w:rPr>
+                <w:rFonts w:ascii="Arial" w:hAnsi="Arial" w:cs="Arial"/>
+              </w:rPr>
+            </w:pPr>
+            <w:r>
+              <w:rPr>
+                <w:rFonts w:ascii="Arial" w:hAnsi="Arial" w:cs="Arial"/>
+              </w:rPr>
+              <w:t>{{</w:t>
+            </w:r>
+            <w:r>
+              <w:rPr>
+                <w:rFonts w:ascii="Arial" w:hAnsi="Arial" w:cs="Arial"/>
+              </w:rPr>
+              <w:t>applicants</w:t>
+            </w:r>
+            <w:r>
+              <w:rPr>
+                <w:rFonts w:ascii="Arial" w:hAnsi="Arial" w:cs="Arial"/>
+              </w:rPr>
+              <w:t>}}</w:t>
+            </w:r>
+            <w:r>
+              <w:rPr>
+                <w:rFonts w:ascii="Arial" w:hAnsi="Arial" w:cs="Arial"/>
+              </w:rPr>
+              <w:t xml:space="preserve"> The [ordinal] </w:t>
+            </w:r>
+            <w:r>
+              <w:rPr>
+                <w:rFonts w:ascii="Arial" w:hAnsi="Arial" w:cs="Arial"/>
+              </w:rPr>
+              <w:t>applicant</w:t>
+            </w:r>
+            <w:r>
+              <w:rPr>
+                <w:rFonts w:ascii="Arial" w:hAnsi="Arial" w:cs="Arial"/>
+              </w:rPr>
+              <w:t xml:space="preserve"> is [name][</w:t>
+            </w:r>
+            <w:proofErr w:type="spellStart"/>
+            <w:r>
+              <w:rPr>
+                <w:rFonts w:ascii="Arial" w:hAnsi="Arial" w:cs="Arial"/>
+              </w:rPr>
+              <w:t>relationshipClause</w:t>
+            </w:r>
+            <w:proofErr w:type="spellEnd"/>
+            <w:r>
+              <w:rPr>
+                <w:rFonts w:ascii="Arial" w:hAnsi="Arial" w:cs="Arial"/>
+              </w:rPr>
+              <w:t>][</w:t>
+            </w:r>
+            <w:proofErr w:type="spellStart"/>
+            <w:r>
+              <w:rPr>
+                <w:rFonts w:ascii="Arial" w:hAnsi="Arial" w:cs="Arial"/>
+              </w:rPr>
+              <w:t>representativeClause</w:t>
+            </w:r>
+            <w:proofErr w:type="spellEnd"/>
+            <w:r>
+              <w:rPr>
+                <w:rFonts w:ascii="Arial" w:hAnsi="Arial" w:cs="Arial"/>
+              </w:rPr>
+              <w:t>]</w:t>
+            </w:r>
+          </w:p>
+        </w:tc>
+      </w:tr>
+      <w:tr>
+        <w:tc>
+          <w:tcPr>
+            <w:tcW w:w="9026" w:type="dxa"/>
+          </w:tcPr>
+          <w:p>
+            <w:pPr>
+              <w:rPr>
+                <w:rFonts w:ascii="Arial" w:hAnsi="Arial" w:cs="Arial"/>
+              </w:rPr>
+            </w:pPr>
+          </w:p>
+        </w:tc>
+      </w:tr>
+    </w:tbl>
     <w:p>
       <w:pPr>
         <w:rPr>
@@ -1014,7 +1077,7 @@
 </file>
 
 <file path=word/styles.xml><?xml version="1.0" encoding="utf-8"?>
-<w:styles xmlns:mc="http://schemas.openxmlformats.org/markup-compatibility/2006" xmlns:r="http://schemas.openxmlformats.org/officeDocument/2006/relationships" xmlns:w="http://schemas.openxmlformats.org/wordprocessingml/2006/main" xmlns:w14="http://schemas.microsoft.com/office/word/2010/wordml" xmlns:w15="http://schemas.microsoft.com/office/word/2012/wordml" xmlns:w16cex="http://schemas.microsoft.com/office/word/2018/wordml/cex" xmlns:w16cid="http://schemas.microsoft.com/office/word/2016/wordml/cid" xmlns:w16="http://schemas.microsoft.com/office/word/2018/wordml" xmlns:w16sdtdh="http://schemas.microsoft.com/office/word/2020/wordml/sdtdatahash" xmlns:w16se="http://schemas.microsoft.com/office/word/2015/wordml/symex" mc:Ignorable="w14 w15 w16se w16cid w16 w16cex w16sdtdh">
+<w:styles xmlns:mc="http://schemas.openxmlformats.org/markup-compatibility/2006" xmlns:r="http://schemas.openxmlformats.org/officeDocument/2006/relationships" xmlns:w="http://schemas.openxmlformats.org/wordprocessingml/2006/main" xmlns:w14="http://schemas.microsoft.com/office/word/2010/wordml" xmlns:w15="http://schemas.microsoft.com/office/word/2012/wordml" xmlns:w16cex="http://schemas.microsoft.com/office/word/2018/wordml/cex" xmlns:w16cid="http://schemas.microsoft.com/office/word/2016/wordml/cid" xmlns:w16="http://schemas.microsoft.com/office/word/2018/wordml" xmlns:w16du="http://schemas.microsoft.com/office/word/2023/wordml/word16du" xmlns:w16sdtdh="http://schemas.microsoft.com/office/word/2020/wordml/sdtdatahash" xmlns:w16sdtfl="http://schemas.microsoft.com/office/word/2024/wordml/sdtformatlock" xmlns:w16se="http://schemas.microsoft.com/office/word/2015/wordml/symex" mc:Ignorable="w14 w15 w16se w16cid w16 w16cex w16sdtdh w16sdtfl w16du">
   <w:docDefaults>
     <w:rPrDefault>
       <w:rPr>

</xml_diff>

<commit_message>
FPVTL-2635 separate line for Act so that it doesn't get affected by uploaded doc style
</commit_message>
<xml_diff>
--- a/src/main/resources/templates/CustomOrderHeader.docx
+++ b/src/main/resources/templates/CustomOrderHeader.docx
@@ -1,6 +1,6 @@
 
 <file path=word/document.xml><?xml version="1.0" encoding="utf-8"?>
-<w:document xmlns:wpc="http://schemas.microsoft.com/office/word/2010/wordprocessingCanvas" xmlns:cx="http://schemas.microsoft.com/office/drawing/2014/chartex" xmlns:cx1="http://schemas.microsoft.com/office/drawing/2015/9/8/chartex" xmlns:cx2="http://schemas.microsoft.com/office/drawing/2015/10/21/chartex" xmlns:cx3="http://schemas.microsoft.com/office/drawing/2016/5/9/chartex" xmlns:cx4="http://schemas.microsoft.com/office/drawing/2016/5/10/chartex" xmlns:cx5="http://schemas.microsoft.com/office/drawing/2016/5/11/chartex" xmlns:cx6="http://schemas.microsoft.com/office/drawing/2016/5/12/chartex" xmlns:cx7="http://schemas.microsoft.com/office/drawing/2016/5/13/chartex" xmlns:cx8="http://schemas.microsoft.com/office/drawing/2016/5/14/chartex" xmlns:mc="http://schemas.openxmlformats.org/markup-compatibility/2006" xmlns:aink="http://schemas.microsoft.com/office/drawing/2016/ink" xmlns:am3d="http://schemas.microsoft.com/office/drawing/2017/model3d" xmlns:o="urn:schemas-microsoft-com:office:office" xmlns:oel="http://schemas.microsoft.com/office/2019/extlst" xmlns:r="http://schemas.openxmlformats.org/officeDocument/2006/relationships" xmlns:m="http://schemas.openxmlformats.org/officeDocument/2006/math" xmlns:v="urn:schemas-microsoft-com:vml" xmlns:wp14="http://schemas.microsoft.com/office/word/2010/wordprocessingDrawing" xmlns:wp="http://schemas.openxmlformats.org/drawingml/2006/wordprocessingDrawing" xmlns:w10="urn:schemas-microsoft-com:office:word" xmlns:w="http://schemas.openxmlformats.org/wordprocessingml/2006/main" xmlns:w14="http://schemas.microsoft.com/office/word/2010/wordml" xmlns:w15="http://schemas.microsoft.com/office/word/2012/wordml" xmlns:w16cex="http://schemas.microsoft.com/office/word/2018/wordml/cex" xmlns:w16cid="http://schemas.microsoft.com/office/word/2016/wordml/cid" xmlns:w16="http://schemas.microsoft.com/office/word/2018/wordml" xmlns:w16du="http://schemas.microsoft.com/office/word/2023/wordml/word16du" xmlns:w16sdtdh="http://schemas.microsoft.com/office/word/2020/wordml/sdtdatahash" xmlns:w16sdtfl="http://schemas.microsoft.com/office/word/2024/wordml/sdtformatlock" xmlns:w16se="http://schemas.microsoft.com/office/word/2015/wordml/symex" xmlns:wpg="http://schemas.microsoft.com/office/word/2010/wordprocessingGroup" xmlns:wpi="http://schemas.microsoft.com/office/word/2010/wordprocessingInk" xmlns:wne="http://schemas.microsoft.com/office/word/2006/wordml" xmlns:wps="http://schemas.microsoft.com/office/word/2010/wordprocessingShape" mc:Ignorable="w14 w15 w16se w16cid w16 w16cex w16sdtdh w16sdtfl w16du wp14">
+<w:document xmlns:wpc="http://schemas.microsoft.com/office/word/2010/wordprocessingCanvas" xmlns:cx="http://schemas.microsoft.com/office/drawing/2014/chartex" xmlns:cx1="http://schemas.microsoft.com/office/drawing/2015/9/8/chartex" xmlns:cx2="http://schemas.microsoft.com/office/drawing/2015/10/21/chartex" xmlns:cx3="http://schemas.microsoft.com/office/drawing/2016/5/9/chartex" xmlns:cx4="http://schemas.microsoft.com/office/drawing/2016/5/10/chartex" xmlns:cx5="http://schemas.microsoft.com/office/drawing/2016/5/11/chartex" xmlns:cx6="http://schemas.microsoft.com/office/drawing/2016/5/12/chartex" xmlns:cx7="http://schemas.microsoft.com/office/drawing/2016/5/13/chartex" xmlns:cx8="http://schemas.microsoft.com/office/drawing/2016/5/14/chartex" xmlns:mc="http://schemas.openxmlformats.org/markup-compatibility/2006" xmlns:aink="http://schemas.microsoft.com/office/drawing/2016/ink" xmlns:am3d="http://schemas.microsoft.com/office/drawing/2017/model3d" xmlns:o="urn:schemas-microsoft-com:office:office" xmlns:oel="http://schemas.microsoft.com/office/2019/extlst" xmlns:r="http://schemas.openxmlformats.org/officeDocument/2006/relationships" xmlns:m="http://schemas.openxmlformats.org/officeDocument/2006/math" xmlns:v="urn:schemas-microsoft-com:vml" xmlns:wp14="http://schemas.microsoft.com/office/word/2010/wordprocessingDrawing" xmlns:wp="http://schemas.openxmlformats.org/drawingml/2006/wordprocessingDrawing" xmlns:w10="urn:schemas-microsoft-com:office:word" xmlns:w="http://schemas.openxmlformats.org/wordprocessingml/2006/main" xmlns:w14="http://schemas.microsoft.com/office/word/2010/wordml" xmlns:w15="http://schemas.microsoft.com/office/word/2012/wordml" xmlns:w16cex="http://schemas.microsoft.com/office/word/2018/wordml/cex" xmlns:w16cid="http://schemas.microsoft.com/office/word/2016/wordml/cid" xmlns:w16="http://schemas.microsoft.com/office/word/2018/wordml" xmlns:w16sdtdh="http://schemas.microsoft.com/office/word/2020/wordml/sdtdatahash" xmlns:w16se="http://schemas.microsoft.com/office/word/2015/wordml/symex" xmlns:wpg="http://schemas.microsoft.com/office/word/2010/wordprocessingGroup" xmlns:wpi="http://schemas.microsoft.com/office/word/2010/wordprocessingInk" xmlns:wne="http://schemas.microsoft.com/office/word/2006/wordml" xmlns:wps="http://schemas.microsoft.com/office/word/2010/wordprocessingShape" mc:Ignorable="w14 w15 w16se w16cid w16 w16cex w16sdtdh wp14">
   <w:body>
     <w:tbl>
       <w:tblPr>
@@ -362,6 +362,19 @@
               <w:t>}}</w:t>
             </w:r>
           </w:p>
+          <w:p>
+            <w:pPr>
+              <w:rPr>
+                <w:rFonts w:ascii="Arial" w:hAnsi="Arial" w:cs="Arial"/>
+              </w:rPr>
+            </w:pPr>
+            <w:r>
+              <w:rPr>
+                <w:rFonts w:ascii="Arial" w:hAnsi="Arial" w:cs="Arial"/>
+              </w:rPr>
+              <w:t>{{actReference}}</w:t>
+            </w:r>
+          </w:p>
         </w:tc>
       </w:tr>
     </w:tbl>
@@ -1077,7 +1090,7 @@
 </file>
 
 <file path=word/styles.xml><?xml version="1.0" encoding="utf-8"?>
-<w:styles xmlns:mc="http://schemas.openxmlformats.org/markup-compatibility/2006" xmlns:r="http://schemas.openxmlformats.org/officeDocument/2006/relationships" xmlns:w="http://schemas.openxmlformats.org/wordprocessingml/2006/main" xmlns:w14="http://schemas.microsoft.com/office/word/2010/wordml" xmlns:w15="http://schemas.microsoft.com/office/word/2012/wordml" xmlns:w16cex="http://schemas.microsoft.com/office/word/2018/wordml/cex" xmlns:w16cid="http://schemas.microsoft.com/office/word/2016/wordml/cid" xmlns:w16="http://schemas.microsoft.com/office/word/2018/wordml" xmlns:w16du="http://schemas.microsoft.com/office/word/2023/wordml/word16du" xmlns:w16sdtdh="http://schemas.microsoft.com/office/word/2020/wordml/sdtdatahash" xmlns:w16sdtfl="http://schemas.microsoft.com/office/word/2024/wordml/sdtformatlock" xmlns:w16se="http://schemas.microsoft.com/office/word/2015/wordml/symex" mc:Ignorable="w14 w15 w16se w16cid w16 w16cex w16sdtdh w16sdtfl w16du">
+<w:styles xmlns:mc="http://schemas.openxmlformats.org/markup-compatibility/2006" xmlns:r="http://schemas.openxmlformats.org/officeDocument/2006/relationships" xmlns:w="http://schemas.openxmlformats.org/wordprocessingml/2006/main" xmlns:w14="http://schemas.microsoft.com/office/word/2010/wordml" xmlns:w15="http://schemas.microsoft.com/office/word/2012/wordml" xmlns:w16cex="http://schemas.microsoft.com/office/word/2018/wordml/cex" xmlns:w16cid="http://schemas.microsoft.com/office/word/2016/wordml/cid" xmlns:w16="http://schemas.microsoft.com/office/word/2018/wordml" xmlns:w16sdtdh="http://schemas.microsoft.com/office/word/2020/wordml/sdtdatahash" xmlns:w16se="http://schemas.microsoft.com/office/word/2015/wordml/symex" mc:Ignorable="w14 w15 w16se w16cid w16 w16cex w16sdtdh">
   <w:docDefaults>
     <w:rPrDefault>
       <w:rPr>

</xml_diff>